<commit_message>
Update XAP pricing and offer generation
</commit_message>
<xml_diff>
--- a/server/templates/tilbud/tilbud-stromskinner-template.docx
+++ b/server/templates/tilbud/tilbud-stromskinner-template.docx
@@ -1,6 +1,6 @@
 
 <file path=word/document.xml><?xml version="1.0" encoding="utf-8"?>
-<w:document xmlns:wpc="http://schemas.microsoft.com/office/word/2010/wordprocessingCanvas" xmlns:cx="http://schemas.microsoft.com/office/drawing/2014/chartex" xmlns:cx1="http://schemas.microsoft.com/office/drawing/2015/9/8/chartex" xmlns:cx2="http://schemas.microsoft.com/office/drawing/2015/10/21/chartex" xmlns:cx3="http://schemas.microsoft.com/office/drawing/2016/5/9/chartex" xmlns:cx4="http://schemas.microsoft.com/office/drawing/2016/5/10/chartex" xmlns:cx5="http://schemas.microsoft.com/office/drawing/2016/5/11/chartex" xmlns:cx6="http://schemas.microsoft.com/office/drawing/2016/5/12/chartex" xmlns:cx7="http://schemas.microsoft.com/office/drawing/2016/5/13/chartex" xmlns:cx8="http://schemas.microsoft.com/office/drawing/2016/5/14/chartex" xmlns:mc="http://schemas.openxmlformats.org/markup-compatibility/2006" xmlns:aink="http://schemas.microsoft.com/office/drawing/2016/ink" xmlns:am3d="http://schemas.microsoft.com/office/drawing/2017/model3d" xmlns:o="urn:schemas-microsoft-com:office:office" xmlns:oel="http://schemas.microsoft.com/office/2019/extlst" xmlns:r="http://schemas.openxmlformats.org/officeDocument/2006/relationships" xmlns:m="http://schemas.openxmlformats.org/officeDocument/2006/math" xmlns:v="urn:schemas-microsoft-com:vml" xmlns:wp14="http://schemas.microsoft.com/office/word/2010/wordprocessingDrawing" xmlns:wp="http://schemas.openxmlformats.org/drawingml/2006/wordprocessingDrawing" xmlns:w10="urn:schemas-microsoft-com:office:word" xmlns:w="http://schemas.openxmlformats.org/wordprocessingml/2006/main" xmlns:w14="http://schemas.microsoft.com/office/word/2010/wordml" xmlns:w15="http://schemas.microsoft.com/office/word/2012/wordml" xmlns:w16cei="http://schemas.microsoft.com/office/word/2026/wordml/cei" xmlns:w16cex="http://schemas.microsoft.com/office/word/2018/wordml/cex" xmlns:w16cid="http://schemas.microsoft.com/office/word/2016/wordml/cid" xmlns:w16="http://schemas.microsoft.com/office/word/2018/wordml" xmlns:w16du="http://schemas.microsoft.com/office/word/2023/wordml/word16du" xmlns:w16sdtdh="http://schemas.microsoft.com/office/word/2020/wordml/sdtdatahash" xmlns:w16sdtfl="http://schemas.microsoft.com/office/word/2024/wordml/sdtformatlock" xmlns:w16se="http://schemas.microsoft.com/office/word/2015/wordml/symex" xmlns:wpg="http://schemas.microsoft.com/office/word/2010/wordprocessingGroup" xmlns:wpi="http://schemas.microsoft.com/office/word/2010/wordprocessingInk" xmlns:wne="http://schemas.microsoft.com/office/word/2006/wordml" xmlns:wps="http://schemas.microsoft.com/office/word/2010/wordprocessingShape" mc:Ignorable="w14 w15 w16se w16cid w16 w16cex w16sdtdh w16sdtfl w16du wp14">
+<w:document xmlns:wpc="http://schemas.microsoft.com/office/word/2010/wordprocessingCanvas" xmlns:cx="http://schemas.microsoft.com/office/drawing/2014/chartex" xmlns:cx1="http://schemas.microsoft.com/office/drawing/2015/9/8/chartex" xmlns:cx2="http://schemas.microsoft.com/office/drawing/2015/10/21/chartex" xmlns:cx3="http://schemas.microsoft.com/office/drawing/2016/5/9/chartex" xmlns:cx4="http://schemas.microsoft.com/office/drawing/2016/5/10/chartex" xmlns:cx5="http://schemas.microsoft.com/office/drawing/2016/5/11/chartex" xmlns:cx6="http://schemas.microsoft.com/office/drawing/2016/5/12/chartex" xmlns:cx7="http://schemas.microsoft.com/office/drawing/2016/5/13/chartex" xmlns:cx8="http://schemas.microsoft.com/office/drawing/2016/5/14/chartex" xmlns:mc="http://schemas.openxmlformats.org/markup-compatibility/2006" xmlns:aink="http://schemas.microsoft.com/office/drawing/2016/ink" xmlns:am3d="http://schemas.microsoft.com/office/drawing/2017/model3d" xmlns:o="urn:schemas-microsoft-com:office:office" xmlns:oel="http://schemas.microsoft.com/office/2019/extlst" xmlns:r="http://schemas.openxmlformats.org/officeDocument/2006/relationships" xmlns:m="http://schemas.openxmlformats.org/officeDocument/2006/math" xmlns:v="urn:schemas-microsoft-com:vml" xmlns:wp14="http://schemas.microsoft.com/office/word/2010/wordprocessingDrawing" xmlns:wp="http://schemas.openxmlformats.org/drawingml/2006/wordprocessingDrawing" xmlns:w10="urn:schemas-microsoft-com:office:word" xmlns:w="http://schemas.openxmlformats.org/wordprocessingml/2006/main" xmlns:w14="http://schemas.microsoft.com/office/word/2010/wordml" xmlns:w15="http://schemas.microsoft.com/office/word/2012/wordml" xmlns:w16cex="http://schemas.microsoft.com/office/word/2018/wordml/cex" xmlns:w16cid="http://schemas.microsoft.com/office/word/2016/wordml/cid" xmlns:w16="http://schemas.microsoft.com/office/word/2018/wordml" xmlns:w16du="http://schemas.microsoft.com/office/word/2023/wordml/word16du" xmlns:w16sdtdh="http://schemas.microsoft.com/office/word/2020/wordml/sdtdatahash" xmlns:w16sdtfl="http://schemas.microsoft.com/office/word/2024/wordml/sdtformatlock" xmlns:w16se="http://schemas.microsoft.com/office/word/2015/wordml/symex" xmlns:wpg="http://schemas.microsoft.com/office/word/2010/wordprocessingGroup" xmlns:wpi="http://schemas.microsoft.com/office/word/2010/wordprocessingInk" xmlns:wne="http://schemas.microsoft.com/office/word/2006/wordml" xmlns:wps="http://schemas.microsoft.com/office/word/2010/wordprocessingShape" mc:Ignorable="w14 w15 w16se w16cid w16 w16cex w16sdtdh w16sdtfl w16du wp14">
   <w:body>
     <w:tbl>
       <w:tblPr>
@@ -1196,23 +1196,29 @@
               <w:t>mtr</w:t>
             </w:r>
             <w:proofErr w:type="spellEnd"/>
-            <w:proofErr w:type="gramStart"/>
-            <w:r>
-              <w:rPr>
-                <w:rFonts w:ascii="Verdana" w:hAnsi="Verdana" w:cs="Arial"/>
-                <w:sz w:val="20"/>
-                <w:szCs w:val="20"/>
-              </w:rPr>
-              <w:t>}}meter</w:t>
-            </w:r>
-            <w:proofErr w:type="gramEnd"/>
-            <w:r>
-              <w:rPr>
-                <w:rFonts w:ascii="Verdana" w:hAnsi="Verdana" w:cs="Arial"/>
-                <w:sz w:val="20"/>
-                <w:szCs w:val="20"/>
-              </w:rPr>
-              <w:t xml:space="preserve"> total lengde</w:t>
+            <w:r>
+              <w:rPr>
+                <w:rFonts w:ascii="Verdana" w:hAnsi="Verdana" w:cs="Arial"/>
+                <w:sz w:val="20"/>
+                <w:szCs w:val="20"/>
+              </w:rPr>
+              <w:t>}}</w:t>
+            </w:r>
+            <w:r>
+              <w:rPr>
+                <w:rFonts w:ascii="Verdana" w:hAnsi="Verdana" w:cs="Arial"/>
+                <w:sz w:val="20"/>
+                <w:szCs w:val="20"/>
+              </w:rPr>
+              <w:t xml:space="preserve"> </w:t>
+            </w:r>
+            <w:r>
+              <w:rPr>
+                <w:rFonts w:ascii="Verdana" w:hAnsi="Verdana" w:cs="Arial"/>
+                <w:sz w:val="20"/>
+                <w:szCs w:val="20"/>
+              </w:rPr>
+              <w:t>meter total lengde</w:t>
             </w:r>
           </w:p>
         </w:tc>
@@ -1313,23 +1319,29 @@
               <w:t>vvk</w:t>
             </w:r>
             <w:proofErr w:type="spellEnd"/>
-            <w:proofErr w:type="gramStart"/>
-            <w:r>
-              <w:rPr>
-                <w:rFonts w:ascii="Verdana" w:hAnsi="Verdana" w:cs="Arial"/>
-                <w:sz w:val="20"/>
-                <w:szCs w:val="20"/>
-              </w:rPr>
-              <w:t>}}stk.</w:t>
-            </w:r>
-            <w:proofErr w:type="gramEnd"/>
-            <w:r>
-              <w:rPr>
-                <w:rFonts w:ascii="Verdana" w:hAnsi="Verdana" w:cs="Arial"/>
-                <w:sz w:val="20"/>
-                <w:szCs w:val="20"/>
-              </w:rPr>
-              <w:t xml:space="preserve"> Vertikal vinkel</w:t>
+            <w:r>
+              <w:rPr>
+                <w:rFonts w:ascii="Verdana" w:hAnsi="Verdana" w:cs="Arial"/>
+                <w:sz w:val="20"/>
+                <w:szCs w:val="20"/>
+              </w:rPr>
+              <w:t>}}</w:t>
+            </w:r>
+            <w:r>
+              <w:rPr>
+                <w:rFonts w:ascii="Verdana" w:hAnsi="Verdana" w:cs="Arial"/>
+                <w:sz w:val="20"/>
+                <w:szCs w:val="20"/>
+              </w:rPr>
+              <w:t xml:space="preserve"> </w:t>
+            </w:r>
+            <w:r>
+              <w:rPr>
+                <w:rFonts w:ascii="Verdana" w:hAnsi="Verdana" w:cs="Arial"/>
+                <w:sz w:val="20"/>
+                <w:szCs w:val="20"/>
+              </w:rPr>
+              <w:t>stk. Vertikal vinkel</w:t>
             </w:r>
           </w:p>
         </w:tc>
@@ -3711,41 +3723,15 @@
                 <w:sz w:val="20"/>
                 <w:szCs w:val="20"/>
               </w:rPr>
-              <w:t>Montasje</w:t>
+              <w:t>Standard prosjektering</w:t>
             </w:r>
           </w:p>
         </w:tc>
       </w:tr>
       <w:tr>
-        <w:tc>
-          <w:tcPr>
-            <w:tcW w:w="10456" w:type="dxa"/>
-          </w:tcPr>
-          <w:p>
-            <w:pPr>
-              <w:pStyle w:val="Listeavsnitt"/>
-              <w:numPr>
-                <w:ilvl w:val="0"/>
-                <w:numId w:val="29"/>
-              </w:numPr>
-              <w:rPr>
-                <w:rFonts w:ascii="Verdana" w:hAnsi="Verdana"/>
-                <w:sz w:val="20"/>
-                <w:szCs w:val="20"/>
-              </w:rPr>
-            </w:pPr>
-            <w:r>
-              <w:rPr>
-                <w:rFonts w:ascii="Verdana" w:hAnsi="Verdana" w:cs="Arial"/>
-                <w:sz w:val="20"/>
-                <w:szCs w:val="20"/>
-              </w:rPr>
-              <w:t>Standard prosjektering</w:t>
-            </w:r>
-          </w:p>
-        </w:tc>
-      </w:tr>
-      <w:tr>
+        <w:trPr>
+          <w:trHeight w:val="81"/>
+        </w:trPr>
         <w:tc>
           <w:tcPr>
             <w:tcW w:w="10456" w:type="dxa"/>
@@ -3907,7 +3893,23 @@
                 <w:sz w:val="20"/>
                 <w:szCs w:val="20"/>
               </w:rPr>
-              <w:t>Tilkobling av fleksibler/lasker mellom skinne og trafo/effektbryter</w:t>
+              <w:t xml:space="preserve">Tilkobling </w:t>
+            </w:r>
+            <w:r>
+              <w:rPr>
+                <w:rFonts w:ascii="Verdana" w:hAnsi="Verdana" w:cs="Arial"/>
+                <w:sz w:val="20"/>
+                <w:szCs w:val="20"/>
+              </w:rPr>
+              <w:t>og</w:t>
+            </w:r>
+            <w:r>
+              <w:rPr>
+                <w:rFonts w:ascii="Verdana" w:hAnsi="Verdana" w:cs="Arial"/>
+                <w:sz w:val="20"/>
+                <w:szCs w:val="20"/>
+              </w:rPr>
+              <w:t xml:space="preserve"> fleksibler/lasker mellom skinne og trafo/effektbryter</w:t>
             </w:r>
           </w:p>
         </w:tc>
@@ -3944,6 +3946,42 @@
                 <w:szCs w:val="20"/>
               </w:rPr>
               <w:t>Prosjektering utover standard</w:t>
+            </w:r>
+          </w:p>
+        </w:tc>
+      </w:tr>
+      <w:tr>
+        <w:tc>
+          <w:tcPr>
+            <w:tcW w:w="10456" w:type="dxa"/>
+            <w:gridSpan w:val="2"/>
+            <w:tcBorders>
+              <w:top w:val="nil"/>
+              <w:left w:val="nil"/>
+              <w:bottom w:val="nil"/>
+              <w:right w:val="nil"/>
+            </w:tcBorders>
+          </w:tcPr>
+          <w:p>
+            <w:pPr>
+              <w:pStyle w:val="Listeavsnitt"/>
+              <w:numPr>
+                <w:ilvl w:val="0"/>
+                <w:numId w:val="30"/>
+              </w:numPr>
+              <w:rPr>
+                <w:rFonts w:ascii="Verdana" w:hAnsi="Verdana" w:cs="Arial"/>
+                <w:sz w:val="20"/>
+                <w:szCs w:val="20"/>
+              </w:rPr>
+            </w:pPr>
+            <w:r>
+              <w:rPr>
+                <w:rFonts w:ascii="Verdana" w:hAnsi="Verdana" w:cs="Arial"/>
+                <w:sz w:val="20"/>
+                <w:szCs w:val="20"/>
+              </w:rPr>
+              <w:t>Montasje</w:t>
             </w:r>
           </w:p>
         </w:tc>
@@ -4100,15 +4138,64 @@
         </w:rPr>
         <w:t>Forutsetninger for pris</w:t>
       </w:r>
-      <w:r>
+    </w:p>
+    <w:p>
+      <w:pPr>
+        <w:tabs>
+          <w:tab w:val="left" w:pos="1516"/>
+        </w:tabs>
+        <w:spacing w:after="0" w:line="240" w:lineRule="auto"/>
         <w:rPr>
           <w:rFonts w:ascii="Verdana" w:eastAsia="Times New Roman" w:hAnsi="Verdana" w:cs="Arial"/>
           <w:sz w:val="20"/>
           <w:szCs w:val="20"/>
           <w:lang w:eastAsia="en-US"/>
         </w:rPr>
-        <w:br/>
-        <w:t xml:space="preserve">Tilbudt pris for montasje er basert på en sammenhengende og uavbrutt arbeidsprosess innenfor ordinær arbeidstid kl. 07:00–19:00. Prisen forutsetter videre: </w:t>
+      </w:pPr>
+      <w:r>
+        <w:rPr>
+          <w:rFonts w:ascii="Verdana" w:eastAsia="Times New Roman" w:hAnsi="Verdana" w:cs="Arial"/>
+          <w:sz w:val="20"/>
+          <w:szCs w:val="20"/>
+          <w:lang w:eastAsia="en-US"/>
+        </w:rPr>
+        <w:t>Montasjeprisen i tilbudet er kun en budsjettpris, for nøyaktig pris må vi ha detaljtegninger og/eller befaring.</w:t>
+      </w:r>
+      <w:r>
+        <w:rPr>
+          <w:rFonts w:ascii="Verdana" w:eastAsia="Times New Roman" w:hAnsi="Verdana" w:cs="Arial"/>
+          <w:sz w:val="20"/>
+          <w:szCs w:val="20"/>
+          <w:lang w:eastAsia="en-US"/>
+        </w:rPr>
+        <w:t xml:space="preserve"> P</w:t>
+      </w:r>
+      <w:r>
+        <w:rPr>
+          <w:rFonts w:ascii="Verdana" w:eastAsia="Times New Roman" w:hAnsi="Verdana" w:cs="Arial"/>
+          <w:sz w:val="20"/>
+          <w:szCs w:val="20"/>
+          <w:lang w:eastAsia="en-US"/>
+        </w:rPr>
+        <w:t>ris</w:t>
+      </w:r>
+      <w:r>
+        <w:rPr>
+          <w:rFonts w:ascii="Verdana" w:eastAsia="Times New Roman" w:hAnsi="Verdana" w:cs="Arial"/>
+          <w:sz w:val="20"/>
+          <w:szCs w:val="20"/>
+          <w:lang w:eastAsia="en-US"/>
+        </w:rPr>
+        <w:t>en</w:t>
+      </w:r>
+      <w:r>
+        <w:rPr>
+          <w:rFonts w:ascii="Verdana" w:eastAsia="Times New Roman" w:hAnsi="Verdana" w:cs="Arial"/>
+          <w:sz w:val="20"/>
+          <w:szCs w:val="20"/>
+          <w:lang w:eastAsia="en-US"/>
+        </w:rPr>
+        <w:t xml:space="preserve"> for montasje er basert på en sammenhengende og uavbrutt arbeidsprosess innenfor ordinær arbeidstid kl. 07:00–19:00. Prisen forutsetter videre: </w:t>
       </w:r>
     </w:p>
     <w:tbl>
@@ -4591,17 +4678,47 @@
           <w:szCs w:val="20"/>
           <w:lang w:eastAsia="en-US"/>
         </w:rPr>
-        <w:t>Lossing og kraning</w:t>
-      </w:r>
-      <w:r>
+        <w:t>Lossing og Lagring</w:t>
+      </w:r>
+    </w:p>
+    <w:p>
+      <w:pPr>
+        <w:spacing w:after="0" w:line="240" w:lineRule="auto"/>
         <w:rPr>
           <w:rFonts w:ascii="Verdana" w:eastAsia="Times New Roman" w:hAnsi="Verdana" w:cs="Arial"/>
           <w:sz w:val="20"/>
           <w:szCs w:val="20"/>
           <w:lang w:eastAsia="en-US"/>
         </w:rPr>
-        <w:br/>
-        <w:t>Oppdragsgiver er ansvarlig for lossing og eventuell kraning av strømskinner på byggeplass.</w:t>
+      </w:pPr>
+      <w:r>
+        <w:rPr>
+          <w:rFonts w:ascii="Verdana" w:eastAsia="Times New Roman" w:hAnsi="Verdana" w:cs="Arial"/>
+          <w:sz w:val="20"/>
+          <w:szCs w:val="20"/>
+          <w:lang w:eastAsia="en-US"/>
+        </w:rPr>
+        <w:t>Oppdragsgiver er ansvarlig for lossing eventuelt kraning av strømskinner på byggeplass.</w:t>
+      </w:r>
+    </w:p>
+    <w:p>
+      <w:pPr>
+        <w:spacing w:after="0" w:line="240" w:lineRule="auto"/>
+        <w:rPr>
+          <w:rFonts w:ascii="Verdana" w:eastAsia="Times New Roman" w:hAnsi="Verdana" w:cs="Arial"/>
+          <w:sz w:val="20"/>
+          <w:szCs w:val="20"/>
+          <w:lang w:eastAsia="en-US"/>
+        </w:rPr>
+      </w:pPr>
+      <w:r>
+        <w:rPr>
+          <w:rFonts w:ascii="Verdana" w:eastAsia="Times New Roman" w:hAnsi="Verdana" w:cs="Arial"/>
+          <w:sz w:val="20"/>
+          <w:szCs w:val="20"/>
+          <w:lang w:eastAsia="en-US"/>
+        </w:rPr>
+        <w:t>Strømskinner skal lagres tørt under tak i nærheten av montasje stedet, støpemasse til epoxy strømskinner skal lagres innendørs 20°C</w:t>
       </w:r>
     </w:p>
     <w:p>
@@ -6843,7 +6960,27 @@
                 <w:szCs w:val="20"/>
                 <w:lang w:eastAsia="ja-JP"/>
               </w:rPr>
-              <w:t>kr 1 020,00</w:t>
+              <w:t xml:space="preserve">kr 1 </w:t>
+            </w:r>
+            <w:r>
+              <w:rPr>
+                <w:rFonts w:ascii="Verdana" w:eastAsia="Times New Roman" w:hAnsi="Verdana" w:cs="Times New Roman"/>
+                <w:color w:val="000000"/>
+                <w:sz w:val="20"/>
+                <w:szCs w:val="20"/>
+                <w:lang w:eastAsia="ja-JP"/>
+              </w:rPr>
+              <w:t>15</w:t>
+            </w:r>
+            <w:r>
+              <w:rPr>
+                <w:rFonts w:ascii="Verdana" w:eastAsia="Times New Roman" w:hAnsi="Verdana" w:cs="Times New Roman"/>
+                <w:color w:val="000000"/>
+                <w:sz w:val="20"/>
+                <w:szCs w:val="20"/>
+                <w:lang w:eastAsia="ja-JP"/>
+              </w:rPr>
+              <w:t>0,00</w:t>
             </w:r>
           </w:p>
         </w:tc>
@@ -6874,7 +7011,27 @@
                 <w:szCs w:val="20"/>
                 <w:lang w:eastAsia="ja-JP"/>
               </w:rPr>
-              <w:t>kr 1 320,00</w:t>
+              <w:t xml:space="preserve">kr 1 </w:t>
+            </w:r>
+            <w:r>
+              <w:rPr>
+                <w:rFonts w:ascii="Verdana" w:eastAsia="Times New Roman" w:hAnsi="Verdana" w:cs="Times New Roman"/>
+                <w:color w:val="000000"/>
+                <w:sz w:val="20"/>
+                <w:szCs w:val="20"/>
+                <w:lang w:eastAsia="ja-JP"/>
+              </w:rPr>
+              <w:t>45</w:t>
+            </w:r>
+            <w:r>
+              <w:rPr>
+                <w:rFonts w:ascii="Verdana" w:eastAsia="Times New Roman" w:hAnsi="Verdana" w:cs="Times New Roman"/>
+                <w:color w:val="000000"/>
+                <w:sz w:val="20"/>
+                <w:szCs w:val="20"/>
+                <w:lang w:eastAsia="ja-JP"/>
+              </w:rPr>
+              <w:t>0,00</w:t>
             </w:r>
           </w:p>
         </w:tc>
@@ -6904,7 +7061,47 @@
                 <w:szCs w:val="20"/>
                 <w:lang w:eastAsia="ja-JP"/>
               </w:rPr>
-              <w:t>kr 1 800,00</w:t>
+              <w:t xml:space="preserve">kr </w:t>
+            </w:r>
+            <w:r>
+              <w:rPr>
+                <w:rFonts w:ascii="Verdana" w:eastAsia="Times New Roman" w:hAnsi="Verdana" w:cs="Times New Roman"/>
+                <w:color w:val="000000"/>
+                <w:sz w:val="20"/>
+                <w:szCs w:val="20"/>
+                <w:lang w:eastAsia="ja-JP"/>
+              </w:rPr>
+              <w:t>2</w:t>
+            </w:r>
+            <w:r>
+              <w:rPr>
+                <w:rFonts w:ascii="Verdana" w:eastAsia="Times New Roman" w:hAnsi="Verdana" w:cs="Times New Roman"/>
+                <w:color w:val="000000"/>
+                <w:sz w:val="20"/>
+                <w:szCs w:val="20"/>
+                <w:lang w:eastAsia="ja-JP"/>
+              </w:rPr>
+              <w:t xml:space="preserve"> </w:t>
+            </w:r>
+            <w:r>
+              <w:rPr>
+                <w:rFonts w:ascii="Verdana" w:eastAsia="Times New Roman" w:hAnsi="Verdana" w:cs="Times New Roman"/>
+                <w:color w:val="000000"/>
+                <w:sz w:val="20"/>
+                <w:szCs w:val="20"/>
+                <w:lang w:eastAsia="ja-JP"/>
+              </w:rPr>
+              <w:t>0</w:t>
+            </w:r>
+            <w:r>
+              <w:rPr>
+                <w:rFonts w:ascii="Verdana" w:eastAsia="Times New Roman" w:hAnsi="Verdana" w:cs="Times New Roman"/>
+                <w:color w:val="000000"/>
+                <w:sz w:val="20"/>
+                <w:szCs w:val="20"/>
+                <w:lang w:eastAsia="ja-JP"/>
+              </w:rPr>
+              <w:t>00,00</w:t>
             </w:r>
           </w:p>
         </w:tc>
@@ -6938,7 +7135,17 @@
                 <w:szCs w:val="20"/>
                 <w:lang w:eastAsia="ja-JP"/>
               </w:rPr>
-              <w:t>Ingeniør</w:t>
+              <w:t>Supervisor</w:t>
+            </w:r>
+            <w:r>
+              <w:rPr>
+                <w:rFonts w:ascii="Verdana" w:eastAsia="Times New Roman" w:hAnsi="Verdana" w:cs="Times New Roman"/>
+                <w:color w:val="000000"/>
+                <w:sz w:val="20"/>
+                <w:szCs w:val="20"/>
+                <w:lang w:eastAsia="ja-JP"/>
+              </w:rPr>
+              <w:t xml:space="preserve"> </w:t>
             </w:r>
           </w:p>
         </w:tc>
@@ -6969,7 +7176,27 @@
                 <w:szCs w:val="20"/>
                 <w:lang w:eastAsia="ja-JP"/>
               </w:rPr>
-              <w:t>kr 1 650,00</w:t>
+              <w:t xml:space="preserve">kr 1 </w:t>
+            </w:r>
+            <w:r>
+              <w:rPr>
+                <w:rFonts w:ascii="Verdana" w:eastAsia="Times New Roman" w:hAnsi="Verdana" w:cs="Times New Roman"/>
+                <w:color w:val="000000"/>
+                <w:sz w:val="20"/>
+                <w:szCs w:val="20"/>
+                <w:lang w:eastAsia="ja-JP"/>
+              </w:rPr>
+              <w:t>3</w:t>
+            </w:r>
+            <w:r>
+              <w:rPr>
+                <w:rFonts w:ascii="Verdana" w:eastAsia="Times New Roman" w:hAnsi="Verdana" w:cs="Times New Roman"/>
+                <w:color w:val="000000"/>
+                <w:sz w:val="20"/>
+                <w:szCs w:val="20"/>
+                <w:lang w:eastAsia="ja-JP"/>
+              </w:rPr>
+              <w:t>50,00</w:t>
             </w:r>
           </w:p>
         </w:tc>
@@ -6979,7 +7206,6 @@
             <w:gridSpan w:val="4"/>
             <w:noWrap/>
             <w:vAlign w:val="center"/>
-            <w:hideMark/>
           </w:tcPr>
           <w:p>
             <w:pPr>
@@ -7000,7 +7226,37 @@
                 <w:szCs w:val="20"/>
                 <w:lang w:eastAsia="ja-JP"/>
               </w:rPr>
-              <w:t>kr 2 270,00</w:t>
+              <w:t xml:space="preserve">kr 1 </w:t>
+            </w:r>
+            <w:r>
+              <w:rPr>
+                <w:rFonts w:ascii="Verdana" w:eastAsia="Times New Roman" w:hAnsi="Verdana" w:cs="Times New Roman"/>
+                <w:color w:val="000000"/>
+                <w:sz w:val="20"/>
+                <w:szCs w:val="20"/>
+                <w:lang w:eastAsia="ja-JP"/>
+              </w:rPr>
+              <w:t>7</w:t>
+            </w:r>
+            <w:r>
+              <w:rPr>
+                <w:rFonts w:ascii="Verdana" w:eastAsia="Times New Roman" w:hAnsi="Verdana" w:cs="Times New Roman"/>
+                <w:color w:val="000000"/>
+                <w:sz w:val="20"/>
+                <w:szCs w:val="20"/>
+                <w:lang w:eastAsia="ja-JP"/>
+              </w:rPr>
+              <w:t>5</w:t>
+            </w:r>
+            <w:r>
+              <w:rPr>
+                <w:rFonts w:ascii="Verdana" w:eastAsia="Times New Roman" w:hAnsi="Verdana" w:cs="Times New Roman"/>
+                <w:color w:val="000000"/>
+                <w:sz w:val="20"/>
+                <w:szCs w:val="20"/>
+                <w:lang w:eastAsia="ja-JP"/>
+              </w:rPr>
+              <w:t>0,00</w:t>
             </w:r>
           </w:p>
         </w:tc>
@@ -7009,7 +7265,330 @@
             <w:tcW w:w="1919" w:type="dxa"/>
             <w:noWrap/>
             <w:vAlign w:val="center"/>
-            <w:hideMark/>
+          </w:tcPr>
+          <w:p>
+            <w:pPr>
+              <w:jc w:val="right"/>
+              <w:rPr>
+                <w:rFonts w:ascii="Verdana" w:eastAsia="Times New Roman" w:hAnsi="Verdana" w:cs="Times New Roman"/>
+                <w:color w:val="000000"/>
+                <w:sz w:val="20"/>
+                <w:szCs w:val="20"/>
+                <w:lang w:eastAsia="ja-JP"/>
+              </w:rPr>
+            </w:pPr>
+            <w:r>
+              <w:rPr>
+                <w:rFonts w:ascii="Verdana" w:eastAsia="Times New Roman" w:hAnsi="Verdana" w:cs="Times New Roman"/>
+                <w:color w:val="000000"/>
+                <w:sz w:val="20"/>
+                <w:szCs w:val="20"/>
+                <w:lang w:eastAsia="ja-JP"/>
+              </w:rPr>
+              <w:t xml:space="preserve">kr </w:t>
+            </w:r>
+            <w:r>
+              <w:rPr>
+                <w:rFonts w:ascii="Verdana" w:eastAsia="Times New Roman" w:hAnsi="Verdana" w:cs="Times New Roman"/>
+                <w:color w:val="000000"/>
+                <w:sz w:val="20"/>
+                <w:szCs w:val="20"/>
+                <w:lang w:eastAsia="ja-JP"/>
+              </w:rPr>
+              <w:t>2</w:t>
+            </w:r>
+            <w:r>
+              <w:rPr>
+                <w:rFonts w:ascii="Verdana" w:eastAsia="Times New Roman" w:hAnsi="Verdana" w:cs="Times New Roman"/>
+                <w:color w:val="000000"/>
+                <w:sz w:val="20"/>
+                <w:szCs w:val="20"/>
+                <w:lang w:eastAsia="ja-JP"/>
+              </w:rPr>
+              <w:t xml:space="preserve"> </w:t>
+            </w:r>
+            <w:r>
+              <w:rPr>
+                <w:rFonts w:ascii="Verdana" w:eastAsia="Times New Roman" w:hAnsi="Verdana" w:cs="Times New Roman"/>
+                <w:color w:val="000000"/>
+                <w:sz w:val="20"/>
+                <w:szCs w:val="20"/>
+                <w:lang w:eastAsia="ja-JP"/>
+              </w:rPr>
+              <w:t>3</w:t>
+            </w:r>
+            <w:r>
+              <w:rPr>
+                <w:rFonts w:ascii="Verdana" w:eastAsia="Times New Roman" w:hAnsi="Verdana" w:cs="Times New Roman"/>
+                <w:color w:val="000000"/>
+                <w:sz w:val="20"/>
+                <w:szCs w:val="20"/>
+                <w:lang w:eastAsia="ja-JP"/>
+              </w:rPr>
+              <w:t>00,00</w:t>
+            </w:r>
+          </w:p>
+        </w:tc>
+      </w:tr>
+      <w:tr>
+        <w:trPr>
+          <w:trHeight w:val="300"/>
+        </w:trPr>
+        <w:tc>
+          <w:tcPr>
+            <w:tcW w:w="3780" w:type="dxa"/>
+            <w:noWrap/>
+            <w:vAlign w:val="center"/>
+          </w:tcPr>
+          <w:p>
+            <w:pPr>
+              <w:rPr>
+                <w:rFonts w:ascii="Verdana" w:eastAsia="Times New Roman" w:hAnsi="Verdana" w:cs="Times New Roman"/>
+                <w:color w:val="000000"/>
+                <w:sz w:val="20"/>
+                <w:szCs w:val="20"/>
+                <w:lang w:eastAsia="ja-JP"/>
+              </w:rPr>
+            </w:pPr>
+            <w:r>
+              <w:rPr>
+                <w:rFonts w:ascii="Verdana" w:eastAsia="Times New Roman" w:hAnsi="Verdana" w:cs="Times New Roman"/>
+                <w:color w:val="000000"/>
+                <w:sz w:val="20"/>
+                <w:szCs w:val="20"/>
+                <w:lang w:eastAsia="ja-JP"/>
+              </w:rPr>
+              <w:t>Ingeniør</w:t>
+            </w:r>
+          </w:p>
+        </w:tc>
+        <w:tc>
+          <w:tcPr>
+            <w:tcW w:w="1918" w:type="dxa"/>
+            <w:gridSpan w:val="2"/>
+            <w:noWrap/>
+            <w:vAlign w:val="center"/>
+          </w:tcPr>
+          <w:p>
+            <w:pPr>
+              <w:jc w:val="right"/>
+              <w:rPr>
+                <w:rFonts w:ascii="Verdana" w:eastAsia="Times New Roman" w:hAnsi="Verdana" w:cs="Times New Roman"/>
+                <w:color w:val="000000"/>
+                <w:sz w:val="20"/>
+                <w:szCs w:val="20"/>
+                <w:lang w:eastAsia="ja-JP"/>
+              </w:rPr>
+            </w:pPr>
+            <w:r>
+              <w:rPr>
+                <w:rFonts w:ascii="Verdana" w:eastAsia="Times New Roman" w:hAnsi="Verdana" w:cs="Times New Roman"/>
+                <w:color w:val="000000"/>
+                <w:sz w:val="20"/>
+                <w:szCs w:val="20"/>
+                <w:lang w:eastAsia="ja-JP"/>
+              </w:rPr>
+              <w:t xml:space="preserve">kr 1 </w:t>
+            </w:r>
+            <w:r>
+              <w:rPr>
+                <w:rFonts w:ascii="Verdana" w:eastAsia="Times New Roman" w:hAnsi="Verdana" w:cs="Times New Roman"/>
+                <w:color w:val="000000"/>
+                <w:sz w:val="20"/>
+                <w:szCs w:val="20"/>
+                <w:lang w:eastAsia="ja-JP"/>
+              </w:rPr>
+              <w:t>6</w:t>
+            </w:r>
+            <w:r>
+              <w:rPr>
+                <w:rFonts w:ascii="Verdana" w:eastAsia="Times New Roman" w:hAnsi="Verdana" w:cs="Times New Roman"/>
+                <w:color w:val="000000"/>
+                <w:sz w:val="20"/>
+                <w:szCs w:val="20"/>
+                <w:lang w:eastAsia="ja-JP"/>
+              </w:rPr>
+              <w:t>50,00</w:t>
+            </w:r>
+          </w:p>
+        </w:tc>
+        <w:tc>
+          <w:tcPr>
+            <w:tcW w:w="1918" w:type="dxa"/>
+            <w:gridSpan w:val="4"/>
+            <w:noWrap/>
+            <w:vAlign w:val="center"/>
+          </w:tcPr>
+          <w:p>
+            <w:pPr>
+              <w:jc w:val="right"/>
+              <w:rPr>
+                <w:rFonts w:ascii="Verdana" w:eastAsia="Times New Roman" w:hAnsi="Verdana" w:cs="Times New Roman"/>
+                <w:color w:val="000000"/>
+                <w:sz w:val="20"/>
+                <w:szCs w:val="20"/>
+                <w:lang w:eastAsia="ja-JP"/>
+              </w:rPr>
+            </w:pPr>
+            <w:r>
+              <w:rPr>
+                <w:rFonts w:ascii="Verdana" w:eastAsia="Times New Roman" w:hAnsi="Verdana" w:cs="Times New Roman"/>
+                <w:color w:val="000000"/>
+                <w:sz w:val="20"/>
+                <w:szCs w:val="20"/>
+                <w:lang w:eastAsia="ja-JP"/>
+              </w:rPr>
+              <w:t>kr 2 270,00</w:t>
+            </w:r>
+          </w:p>
+        </w:tc>
+        <w:tc>
+          <w:tcPr>
+            <w:tcW w:w="1919" w:type="dxa"/>
+            <w:noWrap/>
+            <w:vAlign w:val="center"/>
+          </w:tcPr>
+          <w:p>
+            <w:pPr>
+              <w:jc w:val="right"/>
+              <w:rPr>
+                <w:rFonts w:ascii="Verdana" w:eastAsia="Times New Roman" w:hAnsi="Verdana" w:cs="Times New Roman"/>
+                <w:color w:val="000000"/>
+                <w:sz w:val="20"/>
+                <w:szCs w:val="20"/>
+                <w:lang w:eastAsia="ja-JP"/>
+              </w:rPr>
+            </w:pPr>
+            <w:r>
+              <w:rPr>
+                <w:rFonts w:ascii="Verdana" w:eastAsia="Times New Roman" w:hAnsi="Verdana" w:cs="Times New Roman"/>
+                <w:color w:val="000000"/>
+                <w:sz w:val="20"/>
+                <w:szCs w:val="20"/>
+                <w:lang w:eastAsia="ja-JP"/>
+              </w:rPr>
+              <w:t>kr 2 620,00</w:t>
+            </w:r>
+          </w:p>
+        </w:tc>
+      </w:tr>
+      <w:tr>
+        <w:trPr>
+          <w:trHeight w:val="300"/>
+        </w:trPr>
+        <w:tc>
+          <w:tcPr>
+            <w:tcW w:w="3780" w:type="dxa"/>
+            <w:noWrap/>
+            <w:vAlign w:val="center"/>
+          </w:tcPr>
+          <w:p>
+            <w:pPr>
+              <w:rPr>
+                <w:rFonts w:ascii="Verdana" w:eastAsia="Times New Roman" w:hAnsi="Verdana" w:cs="Times New Roman"/>
+                <w:color w:val="000000"/>
+                <w:sz w:val="20"/>
+                <w:szCs w:val="20"/>
+                <w:lang w:eastAsia="ja-JP"/>
+              </w:rPr>
+            </w:pPr>
+            <w:r>
+              <w:rPr>
+                <w:rFonts w:ascii="Verdana" w:eastAsia="Times New Roman" w:hAnsi="Verdana" w:cs="Times New Roman"/>
+                <w:color w:val="000000"/>
+                <w:sz w:val="20"/>
+                <w:szCs w:val="20"/>
+                <w:lang w:eastAsia="ja-JP"/>
+              </w:rPr>
+              <w:t>Prosjektleder</w:t>
+            </w:r>
+          </w:p>
+        </w:tc>
+        <w:tc>
+          <w:tcPr>
+            <w:tcW w:w="1918" w:type="dxa"/>
+            <w:gridSpan w:val="2"/>
+            <w:noWrap/>
+            <w:vAlign w:val="center"/>
+          </w:tcPr>
+          <w:p>
+            <w:pPr>
+              <w:jc w:val="right"/>
+              <w:rPr>
+                <w:rFonts w:ascii="Verdana" w:eastAsia="Times New Roman" w:hAnsi="Verdana" w:cs="Times New Roman"/>
+                <w:color w:val="000000"/>
+                <w:sz w:val="20"/>
+                <w:szCs w:val="20"/>
+                <w:lang w:eastAsia="ja-JP"/>
+              </w:rPr>
+            </w:pPr>
+            <w:r>
+              <w:rPr>
+                <w:rFonts w:ascii="Verdana" w:eastAsia="Times New Roman" w:hAnsi="Verdana" w:cs="Times New Roman"/>
+                <w:color w:val="000000"/>
+                <w:sz w:val="20"/>
+                <w:szCs w:val="20"/>
+                <w:lang w:eastAsia="ja-JP"/>
+              </w:rPr>
+              <w:t xml:space="preserve">kr 1 </w:t>
+            </w:r>
+            <w:r>
+              <w:rPr>
+                <w:rFonts w:ascii="Verdana" w:eastAsia="Times New Roman" w:hAnsi="Verdana" w:cs="Times New Roman"/>
+                <w:color w:val="000000"/>
+                <w:sz w:val="20"/>
+                <w:szCs w:val="20"/>
+                <w:lang w:eastAsia="ja-JP"/>
+              </w:rPr>
+              <w:t>6</w:t>
+            </w:r>
+            <w:r>
+              <w:rPr>
+                <w:rFonts w:ascii="Verdana" w:eastAsia="Times New Roman" w:hAnsi="Verdana" w:cs="Times New Roman"/>
+                <w:color w:val="000000"/>
+                <w:sz w:val="20"/>
+                <w:szCs w:val="20"/>
+                <w:lang w:eastAsia="ja-JP"/>
+              </w:rPr>
+              <w:t>50,00</w:t>
+            </w:r>
+          </w:p>
+        </w:tc>
+        <w:tc>
+          <w:tcPr>
+            <w:tcW w:w="1918" w:type="dxa"/>
+            <w:gridSpan w:val="4"/>
+            <w:noWrap/>
+            <w:vAlign w:val="center"/>
+          </w:tcPr>
+          <w:p>
+            <w:pPr>
+              <w:jc w:val="right"/>
+              <w:rPr>
+                <w:rFonts w:ascii="Verdana" w:eastAsia="Times New Roman" w:hAnsi="Verdana" w:cs="Times New Roman"/>
+                <w:color w:val="000000"/>
+                <w:sz w:val="20"/>
+                <w:szCs w:val="20"/>
+                <w:lang w:eastAsia="ja-JP"/>
+              </w:rPr>
+            </w:pPr>
+            <w:r>
+              <w:rPr>
+                <w:rFonts w:ascii="Verdana" w:eastAsia="Times New Roman" w:hAnsi="Verdana" w:cs="Times New Roman"/>
+                <w:color w:val="000000"/>
+                <w:sz w:val="20"/>
+                <w:szCs w:val="20"/>
+                <w:lang w:eastAsia="ja-JP"/>
+              </w:rPr>
+              <w:t>kr 2 270,00</w:t>
+            </w:r>
+          </w:p>
+        </w:tc>
+        <w:tc>
+          <w:tcPr>
+            <w:tcW w:w="1919" w:type="dxa"/>
+            <w:noWrap/>
+            <w:vAlign w:val="center"/>
           </w:tcPr>
           <w:p>
             <w:pPr>
@@ -7577,7 +8156,27 @@
                 <w:szCs w:val="20"/>
                 <w:lang w:eastAsia="ja-JP"/>
               </w:rPr>
-              <w:t>kr 870,00</w:t>
+              <w:t>kr 8</w:t>
+            </w:r>
+            <w:r>
+              <w:rPr>
+                <w:rFonts w:ascii="Verdana" w:eastAsia="Times New Roman" w:hAnsi="Verdana" w:cs="Times New Roman"/>
+                <w:color w:val="000000"/>
+                <w:sz w:val="20"/>
+                <w:szCs w:val="20"/>
+                <w:lang w:eastAsia="ja-JP"/>
+              </w:rPr>
+              <w:t>90</w:t>
+            </w:r>
+            <w:r>
+              <w:rPr>
+                <w:rFonts w:ascii="Verdana" w:eastAsia="Times New Roman" w:hAnsi="Verdana" w:cs="Times New Roman"/>
+                <w:color w:val="000000"/>
+                <w:sz w:val="20"/>
+                <w:szCs w:val="20"/>
+                <w:lang w:eastAsia="ja-JP"/>
+              </w:rPr>
+              <w:t>,00</w:t>
             </w:r>
           </w:p>
         </w:tc>
@@ -7608,7 +8207,27 @@
                 <w:szCs w:val="20"/>
                 <w:lang w:eastAsia="ja-JP"/>
               </w:rPr>
-              <w:t>kr 1 140,00</w:t>
+              <w:t xml:space="preserve">kr 1 </w:t>
+            </w:r>
+            <w:r>
+              <w:rPr>
+                <w:rFonts w:ascii="Verdana" w:eastAsia="Times New Roman" w:hAnsi="Verdana" w:cs="Times New Roman"/>
+                <w:color w:val="000000"/>
+                <w:sz w:val="20"/>
+                <w:szCs w:val="20"/>
+                <w:lang w:eastAsia="ja-JP"/>
+              </w:rPr>
+              <w:t>20</w:t>
+            </w:r>
+            <w:r>
+              <w:rPr>
+                <w:rFonts w:ascii="Verdana" w:eastAsia="Times New Roman" w:hAnsi="Verdana" w:cs="Times New Roman"/>
+                <w:color w:val="000000"/>
+                <w:sz w:val="20"/>
+                <w:szCs w:val="20"/>
+                <w:lang w:eastAsia="ja-JP"/>
+              </w:rPr>
+              <w:t>0,00</w:t>
             </w:r>
           </w:p>
         </w:tc>
@@ -7638,7 +8257,27 @@
                 <w:szCs w:val="20"/>
                 <w:lang w:eastAsia="ja-JP"/>
               </w:rPr>
-              <w:t>kr 1 400,00</w:t>
+              <w:t xml:space="preserve">kr 1 </w:t>
+            </w:r>
+            <w:r>
+              <w:rPr>
+                <w:rFonts w:ascii="Verdana" w:eastAsia="Times New Roman" w:hAnsi="Verdana" w:cs="Times New Roman"/>
+                <w:color w:val="000000"/>
+                <w:sz w:val="20"/>
+                <w:szCs w:val="20"/>
+                <w:lang w:eastAsia="ja-JP"/>
+              </w:rPr>
+              <w:t>5</w:t>
+            </w:r>
+            <w:r>
+              <w:rPr>
+                <w:rFonts w:ascii="Verdana" w:eastAsia="Times New Roman" w:hAnsi="Verdana" w:cs="Times New Roman"/>
+                <w:color w:val="000000"/>
+                <w:sz w:val="20"/>
+                <w:szCs w:val="20"/>
+                <w:lang w:eastAsia="ja-JP"/>
+              </w:rPr>
+              <w:t>00,00</w:t>
             </w:r>
           </w:p>
         </w:tc>
@@ -8976,7 +9615,47 @@
                 <w:szCs w:val="20"/>
                 <w:lang w:eastAsia="ja-JP"/>
               </w:rPr>
-              <w:t>kr 1 800,00</w:t>
+              <w:t xml:space="preserve">kr </w:t>
+            </w:r>
+            <w:r>
+              <w:rPr>
+                <w:rFonts w:ascii="Verdana" w:eastAsia="Times New Roman" w:hAnsi="Verdana" w:cs="Times New Roman"/>
+                <w:color w:val="000000"/>
+                <w:sz w:val="20"/>
+                <w:szCs w:val="20"/>
+                <w:lang w:eastAsia="ja-JP"/>
+              </w:rPr>
+              <w:t>2</w:t>
+            </w:r>
+            <w:r>
+              <w:rPr>
+                <w:rFonts w:ascii="Verdana" w:eastAsia="Times New Roman" w:hAnsi="Verdana" w:cs="Times New Roman"/>
+                <w:color w:val="000000"/>
+                <w:sz w:val="20"/>
+                <w:szCs w:val="20"/>
+                <w:lang w:eastAsia="ja-JP"/>
+              </w:rPr>
+              <w:t xml:space="preserve"> </w:t>
+            </w:r>
+            <w:r>
+              <w:rPr>
+                <w:rFonts w:ascii="Verdana" w:eastAsia="Times New Roman" w:hAnsi="Verdana" w:cs="Times New Roman"/>
+                <w:color w:val="000000"/>
+                <w:sz w:val="20"/>
+                <w:szCs w:val="20"/>
+                <w:lang w:eastAsia="ja-JP"/>
+              </w:rPr>
+              <w:t>0</w:t>
+            </w:r>
+            <w:r>
+              <w:rPr>
+                <w:rFonts w:ascii="Verdana" w:eastAsia="Times New Roman" w:hAnsi="Verdana" w:cs="Times New Roman"/>
+                <w:color w:val="000000"/>
+                <w:sz w:val="20"/>
+                <w:szCs w:val="20"/>
+                <w:lang w:eastAsia="ja-JP"/>
+              </w:rPr>
+              <w:t>00,00</w:t>
             </w:r>
           </w:p>
         </w:tc>
@@ -9829,6 +10508,33 @@
           <w:szCs w:val="20"/>
         </w:rPr>
       </w:pPr>
+      <w:r>
+        <w:rPr>
+          <w:rFonts w:ascii="Verdana" w:eastAsia="Times New Roman" w:hAnsi="Verdana" w:cs="Times New Roman"/>
+          <w:b/>
+          <w:sz w:val="20"/>
+          <w:szCs w:val="20"/>
+        </w:rPr>
+        <w:t>Lagring</w:t>
+      </w:r>
+    </w:p>
+    <w:p>
+      <w:pPr>
+        <w:spacing w:after="0" w:line="240" w:lineRule="exact"/>
+        <w:rPr>
+          <w:rFonts w:ascii="Verdana" w:eastAsia="Times New Roman" w:hAnsi="Verdana" w:cs="Times New Roman"/>
+          <w:sz w:val="20"/>
+          <w:szCs w:val="20"/>
+        </w:rPr>
+      </w:pPr>
+      <w:r>
+        <w:rPr>
+          <w:rFonts w:ascii="Verdana" w:eastAsia="Times New Roman" w:hAnsi="Verdana" w:cs="Times New Roman"/>
+          <w:sz w:val="20"/>
+          <w:szCs w:val="20"/>
+        </w:rPr>
+        <w:t>Pris pr. pallplass pr. påbegynte måned etter 30 dager: kr 630,00</w:t>
+      </w:r>
     </w:p>
     <w:p>
       <w:pPr>
@@ -9849,7 +10555,7 @@
           <w:sz w:val="20"/>
           <w:szCs w:val="20"/>
         </w:rPr>
-        <w:t>Lagring</w:t>
+        <w:t>Generelt</w:t>
       </w:r>
     </w:p>
     <w:p>
@@ -9867,56 +10573,9 @@
           <w:sz w:val="20"/>
           <w:szCs w:val="20"/>
         </w:rPr>
-        <w:t>Pris pr. pallplass pr. påbegynte måned etter 30 dager: kr 630,00</w:t>
-      </w:r>
-    </w:p>
-    <w:p>
-      <w:pPr>
-        <w:keepNext/>
-        <w:spacing w:before="280" w:after="0" w:line="240" w:lineRule="exact"/>
-        <w:outlineLvl w:val="1"/>
-        <w:rPr>
-          <w:rFonts w:ascii="Verdana" w:eastAsia="Times New Roman" w:hAnsi="Verdana" w:cs="Times New Roman"/>
-          <w:b/>
-          <w:sz w:val="20"/>
-          <w:szCs w:val="20"/>
-        </w:rPr>
-      </w:pPr>
-      <w:r>
-        <w:rPr>
-          <w:rFonts w:ascii="Verdana" w:eastAsia="Times New Roman" w:hAnsi="Verdana" w:cs="Times New Roman"/>
-          <w:b/>
-          <w:sz w:val="20"/>
-          <w:szCs w:val="20"/>
-        </w:rPr>
-        <w:t>Generelt</w:t>
-      </w:r>
-    </w:p>
-    <w:p>
-      <w:pPr>
-        <w:spacing w:after="0" w:line="240" w:lineRule="exact"/>
-        <w:rPr>
-          <w:rFonts w:ascii="Verdana" w:eastAsia="Times New Roman" w:hAnsi="Verdana" w:cs="Times New Roman"/>
-          <w:sz w:val="20"/>
-          <w:szCs w:val="20"/>
-        </w:rPr>
-      </w:pPr>
-      <w:r>
-        <w:rPr>
-          <w:rFonts w:ascii="Verdana" w:eastAsia="Times New Roman" w:hAnsi="Verdana" w:cs="Times New Roman"/>
-          <w:sz w:val="20"/>
-          <w:szCs w:val="20"/>
-        </w:rPr>
         <w:t>Alle oppgitte priser er eks. mva.</w:t>
       </w:r>
-    </w:p>
-    <w:bookmarkEnd w:id="0"/>
-    <w:p>
-      <w:pPr>
-        <w:rPr>
-          <w:rFonts w:ascii="Verdana" w:hAnsi="Verdana" w:cs="Arial"/>
-        </w:rPr>
-      </w:pPr>
+      <w:bookmarkEnd w:id="0"/>
     </w:p>
     <w:sectPr>
       <w:footerReference w:type="default" r:id="rId14"/>
@@ -9933,7 +10592,7 @@
 </file>
 
 <file path=word/endnotes.xml><?xml version="1.0" encoding="utf-8"?>
-<w:endnotes xmlns:wpc="http://schemas.microsoft.com/office/word/2010/wordprocessingCanvas" xmlns:cx="http://schemas.microsoft.com/office/drawing/2014/chartex" xmlns:cx1="http://schemas.microsoft.com/office/drawing/2015/9/8/chartex" xmlns:cx2="http://schemas.microsoft.com/office/drawing/2015/10/21/chartex" xmlns:cx3="http://schemas.microsoft.com/office/drawing/2016/5/9/chartex" xmlns:cx4="http://schemas.microsoft.com/office/drawing/2016/5/10/chartex" xmlns:cx5="http://schemas.microsoft.com/office/drawing/2016/5/11/chartex" xmlns:cx6="http://schemas.microsoft.com/office/drawing/2016/5/12/chartex" xmlns:cx7="http://schemas.microsoft.com/office/drawing/2016/5/13/chartex" xmlns:cx8="http://schemas.microsoft.com/office/drawing/2016/5/14/chartex" xmlns:mc="http://schemas.openxmlformats.org/markup-compatibility/2006" xmlns:aink="http://schemas.microsoft.com/office/drawing/2016/ink" xmlns:am3d="http://schemas.microsoft.com/office/drawing/2017/model3d" xmlns:o="urn:schemas-microsoft-com:office:office" xmlns:oel="http://schemas.microsoft.com/office/2019/extlst" xmlns:r="http://schemas.openxmlformats.org/officeDocument/2006/relationships" xmlns:m="http://schemas.openxmlformats.org/officeDocument/2006/math" xmlns:v="urn:schemas-microsoft-com:vml" xmlns:wp14="http://schemas.microsoft.com/office/word/2010/wordprocessingDrawing" xmlns:wp="http://schemas.openxmlformats.org/drawingml/2006/wordprocessingDrawing" xmlns:w10="urn:schemas-microsoft-com:office:word" xmlns:w="http://schemas.openxmlformats.org/wordprocessingml/2006/main" xmlns:w14="http://schemas.microsoft.com/office/word/2010/wordml" xmlns:w15="http://schemas.microsoft.com/office/word/2012/wordml" xmlns:w16cei="http://schemas.microsoft.com/office/word/2026/wordml/cei" xmlns:w16cex="http://schemas.microsoft.com/office/word/2018/wordml/cex" xmlns:w16cid="http://schemas.microsoft.com/office/word/2016/wordml/cid" xmlns:w16="http://schemas.microsoft.com/office/word/2018/wordml" xmlns:w16du="http://schemas.microsoft.com/office/word/2023/wordml/word16du" xmlns:w16sdtdh="http://schemas.microsoft.com/office/word/2020/wordml/sdtdatahash" xmlns:w16sdtfl="http://schemas.microsoft.com/office/word/2024/wordml/sdtformatlock" xmlns:w16se="http://schemas.microsoft.com/office/word/2015/wordml/symex" xmlns:wpg="http://schemas.microsoft.com/office/word/2010/wordprocessingGroup" xmlns:wpi="http://schemas.microsoft.com/office/word/2010/wordprocessingInk" xmlns:wne="http://schemas.microsoft.com/office/word/2006/wordml" xmlns:wps="http://schemas.microsoft.com/office/word/2010/wordprocessingShape" mc:Ignorable="w14 w15 w16se w16cid w16 w16cex w16sdtdh w16sdtfl w16du wp14">
+<w:endnotes xmlns:wpc="http://schemas.microsoft.com/office/word/2010/wordprocessingCanvas" xmlns:cx="http://schemas.microsoft.com/office/drawing/2014/chartex" xmlns:cx1="http://schemas.microsoft.com/office/drawing/2015/9/8/chartex" xmlns:cx2="http://schemas.microsoft.com/office/drawing/2015/10/21/chartex" xmlns:cx3="http://schemas.microsoft.com/office/drawing/2016/5/9/chartex" xmlns:cx4="http://schemas.microsoft.com/office/drawing/2016/5/10/chartex" xmlns:cx5="http://schemas.microsoft.com/office/drawing/2016/5/11/chartex" xmlns:cx6="http://schemas.microsoft.com/office/drawing/2016/5/12/chartex" xmlns:cx7="http://schemas.microsoft.com/office/drawing/2016/5/13/chartex" xmlns:cx8="http://schemas.microsoft.com/office/drawing/2016/5/14/chartex" xmlns:mc="http://schemas.openxmlformats.org/markup-compatibility/2006" xmlns:aink="http://schemas.microsoft.com/office/drawing/2016/ink" xmlns:am3d="http://schemas.microsoft.com/office/drawing/2017/model3d" xmlns:o="urn:schemas-microsoft-com:office:office" xmlns:oel="http://schemas.microsoft.com/office/2019/extlst" xmlns:r="http://schemas.openxmlformats.org/officeDocument/2006/relationships" xmlns:m="http://schemas.openxmlformats.org/officeDocument/2006/math" xmlns:v="urn:schemas-microsoft-com:vml" xmlns:wp14="http://schemas.microsoft.com/office/word/2010/wordprocessingDrawing" xmlns:wp="http://schemas.openxmlformats.org/drawingml/2006/wordprocessingDrawing" xmlns:w10="urn:schemas-microsoft-com:office:word" xmlns:w="http://schemas.openxmlformats.org/wordprocessingml/2006/main" xmlns:w14="http://schemas.microsoft.com/office/word/2010/wordml" xmlns:w15="http://schemas.microsoft.com/office/word/2012/wordml" xmlns:w16cex="http://schemas.microsoft.com/office/word/2018/wordml/cex" xmlns:w16cid="http://schemas.microsoft.com/office/word/2016/wordml/cid" xmlns:w16="http://schemas.microsoft.com/office/word/2018/wordml" xmlns:w16du="http://schemas.microsoft.com/office/word/2023/wordml/word16du" xmlns:w16sdtdh="http://schemas.microsoft.com/office/word/2020/wordml/sdtdatahash" xmlns:w16sdtfl="http://schemas.microsoft.com/office/word/2024/wordml/sdtformatlock" xmlns:w16se="http://schemas.microsoft.com/office/word/2015/wordml/symex" xmlns:wpg="http://schemas.microsoft.com/office/word/2010/wordprocessingGroup" xmlns:wpi="http://schemas.microsoft.com/office/word/2010/wordprocessingInk" xmlns:wne="http://schemas.microsoft.com/office/word/2006/wordml" xmlns:wps="http://schemas.microsoft.com/office/word/2010/wordprocessingShape" mc:Ignorable="w14 w15 w16se w16cid w16 w16cex w16sdtdh w16sdtfl w16du wp14">
   <w:endnote w:type="separator" w:id="-1">
     <w:p>
       <w:pPr>
@@ -9958,7 +10617,7 @@
 </file>
 
 <file path=word/footer1.xml><?xml version="1.0" encoding="utf-8"?>
-<w:ftr xmlns:wpc="http://schemas.microsoft.com/office/word/2010/wordprocessingCanvas" xmlns:cx="http://schemas.microsoft.com/office/drawing/2014/chartex" xmlns:cx1="http://schemas.microsoft.com/office/drawing/2015/9/8/chartex" xmlns:cx2="http://schemas.microsoft.com/office/drawing/2015/10/21/chartex" xmlns:cx3="http://schemas.microsoft.com/office/drawing/2016/5/9/chartex" xmlns:cx4="http://schemas.microsoft.com/office/drawing/2016/5/10/chartex" xmlns:cx5="http://schemas.microsoft.com/office/drawing/2016/5/11/chartex" xmlns:cx6="http://schemas.microsoft.com/office/drawing/2016/5/12/chartex" xmlns:cx7="http://schemas.microsoft.com/office/drawing/2016/5/13/chartex" xmlns:cx8="http://schemas.microsoft.com/office/drawing/2016/5/14/chartex" xmlns:mc="http://schemas.openxmlformats.org/markup-compatibility/2006" xmlns:aink="http://schemas.microsoft.com/office/drawing/2016/ink" xmlns:am3d="http://schemas.microsoft.com/office/drawing/2017/model3d" xmlns:o="urn:schemas-microsoft-com:office:office" xmlns:oel="http://schemas.microsoft.com/office/2019/extlst" xmlns:r="http://schemas.openxmlformats.org/officeDocument/2006/relationships" xmlns:m="http://schemas.openxmlformats.org/officeDocument/2006/math" xmlns:v="urn:schemas-microsoft-com:vml" xmlns:wp14="http://schemas.microsoft.com/office/word/2010/wordprocessingDrawing" xmlns:wp="http://schemas.openxmlformats.org/drawingml/2006/wordprocessingDrawing" xmlns:w10="urn:schemas-microsoft-com:office:word" xmlns:w="http://schemas.openxmlformats.org/wordprocessingml/2006/main" xmlns:w14="http://schemas.microsoft.com/office/word/2010/wordml" xmlns:w15="http://schemas.microsoft.com/office/word/2012/wordml" xmlns:w16cei="http://schemas.microsoft.com/office/word/2026/wordml/cei" xmlns:w16cex="http://schemas.microsoft.com/office/word/2018/wordml/cex" xmlns:w16cid="http://schemas.microsoft.com/office/word/2016/wordml/cid" xmlns:w16="http://schemas.microsoft.com/office/word/2018/wordml" xmlns:w16du="http://schemas.microsoft.com/office/word/2023/wordml/word16du" xmlns:w16sdtdh="http://schemas.microsoft.com/office/word/2020/wordml/sdtdatahash" xmlns:w16sdtfl="http://schemas.microsoft.com/office/word/2024/wordml/sdtformatlock" xmlns:w16se="http://schemas.microsoft.com/office/word/2015/wordml/symex" xmlns:wpg="http://schemas.microsoft.com/office/word/2010/wordprocessingGroup" xmlns:wpi="http://schemas.microsoft.com/office/word/2010/wordprocessingInk" xmlns:wne="http://schemas.microsoft.com/office/word/2006/wordml" xmlns:wps="http://schemas.microsoft.com/office/word/2010/wordprocessingShape" mc:Ignorable="w14 w15 w16se w16cid w16 w16cex w16sdtdh w16sdtfl w16du wp14">
+<w:ftr xmlns:wpc="http://schemas.microsoft.com/office/word/2010/wordprocessingCanvas" xmlns:cx="http://schemas.microsoft.com/office/drawing/2014/chartex" xmlns:cx1="http://schemas.microsoft.com/office/drawing/2015/9/8/chartex" xmlns:cx2="http://schemas.microsoft.com/office/drawing/2015/10/21/chartex" xmlns:cx3="http://schemas.microsoft.com/office/drawing/2016/5/9/chartex" xmlns:cx4="http://schemas.microsoft.com/office/drawing/2016/5/10/chartex" xmlns:cx5="http://schemas.microsoft.com/office/drawing/2016/5/11/chartex" xmlns:cx6="http://schemas.microsoft.com/office/drawing/2016/5/12/chartex" xmlns:cx7="http://schemas.microsoft.com/office/drawing/2016/5/13/chartex" xmlns:cx8="http://schemas.microsoft.com/office/drawing/2016/5/14/chartex" xmlns:mc="http://schemas.openxmlformats.org/markup-compatibility/2006" xmlns:aink="http://schemas.microsoft.com/office/drawing/2016/ink" xmlns:am3d="http://schemas.microsoft.com/office/drawing/2017/model3d" xmlns:o="urn:schemas-microsoft-com:office:office" xmlns:oel="http://schemas.microsoft.com/office/2019/extlst" xmlns:r="http://schemas.openxmlformats.org/officeDocument/2006/relationships" xmlns:m="http://schemas.openxmlformats.org/officeDocument/2006/math" xmlns:v="urn:schemas-microsoft-com:vml" xmlns:wp14="http://schemas.microsoft.com/office/word/2010/wordprocessingDrawing" xmlns:wp="http://schemas.openxmlformats.org/drawingml/2006/wordprocessingDrawing" xmlns:w10="urn:schemas-microsoft-com:office:word" xmlns:w="http://schemas.openxmlformats.org/wordprocessingml/2006/main" xmlns:w14="http://schemas.microsoft.com/office/word/2010/wordml" xmlns:w15="http://schemas.microsoft.com/office/word/2012/wordml" xmlns:w16cex="http://schemas.microsoft.com/office/word/2018/wordml/cex" xmlns:w16cid="http://schemas.microsoft.com/office/word/2016/wordml/cid" xmlns:w16="http://schemas.microsoft.com/office/word/2018/wordml" xmlns:w16du="http://schemas.microsoft.com/office/word/2023/wordml/word16du" xmlns:w16sdtdh="http://schemas.microsoft.com/office/word/2020/wordml/sdtdatahash" xmlns:w16sdtfl="http://schemas.microsoft.com/office/word/2024/wordml/sdtformatlock" xmlns:w16se="http://schemas.microsoft.com/office/word/2015/wordml/symex" xmlns:wpg="http://schemas.microsoft.com/office/word/2010/wordprocessingGroup" xmlns:wpi="http://schemas.microsoft.com/office/word/2010/wordprocessingInk" xmlns:wne="http://schemas.microsoft.com/office/word/2006/wordml" xmlns:wps="http://schemas.microsoft.com/office/word/2010/wordprocessingShape" mc:Ignorable="w14 w15 w16se w16cid w16 w16cex w16sdtdh w16sdtfl w16du wp14">
   <w:p>
     <w:pPr>
       <w:pStyle w:val="Bunntekst"/>
@@ -9968,7 +10627,7 @@
 </file>
 
 <file path=word/footer2.xml><?xml version="1.0" encoding="utf-8"?>
-<w:ftr xmlns:wpc="http://schemas.microsoft.com/office/word/2010/wordprocessingCanvas" xmlns:cx="http://schemas.microsoft.com/office/drawing/2014/chartex" xmlns:cx1="http://schemas.microsoft.com/office/drawing/2015/9/8/chartex" xmlns:cx2="http://schemas.microsoft.com/office/drawing/2015/10/21/chartex" xmlns:cx3="http://schemas.microsoft.com/office/drawing/2016/5/9/chartex" xmlns:cx4="http://schemas.microsoft.com/office/drawing/2016/5/10/chartex" xmlns:cx5="http://schemas.microsoft.com/office/drawing/2016/5/11/chartex" xmlns:cx6="http://schemas.microsoft.com/office/drawing/2016/5/12/chartex" xmlns:cx7="http://schemas.microsoft.com/office/drawing/2016/5/13/chartex" xmlns:cx8="http://schemas.microsoft.com/office/drawing/2016/5/14/chartex" xmlns:mc="http://schemas.openxmlformats.org/markup-compatibility/2006" xmlns:aink="http://schemas.microsoft.com/office/drawing/2016/ink" xmlns:am3d="http://schemas.microsoft.com/office/drawing/2017/model3d" xmlns:o="urn:schemas-microsoft-com:office:office" xmlns:oel="http://schemas.microsoft.com/office/2019/extlst" xmlns:r="http://schemas.openxmlformats.org/officeDocument/2006/relationships" xmlns:m="http://schemas.openxmlformats.org/officeDocument/2006/math" xmlns:v="urn:schemas-microsoft-com:vml" xmlns:wp14="http://schemas.microsoft.com/office/word/2010/wordprocessingDrawing" xmlns:wp="http://schemas.openxmlformats.org/drawingml/2006/wordprocessingDrawing" xmlns:w10="urn:schemas-microsoft-com:office:word" xmlns:w="http://schemas.openxmlformats.org/wordprocessingml/2006/main" xmlns:w14="http://schemas.microsoft.com/office/word/2010/wordml" xmlns:w15="http://schemas.microsoft.com/office/word/2012/wordml" xmlns:w16cei="http://schemas.microsoft.com/office/word/2026/wordml/cei" xmlns:w16cex="http://schemas.microsoft.com/office/word/2018/wordml/cex" xmlns:w16cid="http://schemas.microsoft.com/office/word/2016/wordml/cid" xmlns:w16="http://schemas.microsoft.com/office/word/2018/wordml" xmlns:w16du="http://schemas.microsoft.com/office/word/2023/wordml/word16du" xmlns:w16sdtdh="http://schemas.microsoft.com/office/word/2020/wordml/sdtdatahash" xmlns:w16sdtfl="http://schemas.microsoft.com/office/word/2024/wordml/sdtformatlock" xmlns:w16se="http://schemas.microsoft.com/office/word/2015/wordml/symex" xmlns:wpg="http://schemas.microsoft.com/office/word/2010/wordprocessingGroup" xmlns:wpi="http://schemas.microsoft.com/office/word/2010/wordprocessingInk" xmlns:wne="http://schemas.microsoft.com/office/word/2006/wordml" xmlns:wps="http://schemas.microsoft.com/office/word/2010/wordprocessingShape" mc:Ignorable="w14 w15 w16se w16cid w16 w16cex w16sdtdh w16sdtfl w16du wp14">
+<w:ftr xmlns:wpc="http://schemas.microsoft.com/office/word/2010/wordprocessingCanvas" xmlns:cx="http://schemas.microsoft.com/office/drawing/2014/chartex" xmlns:cx1="http://schemas.microsoft.com/office/drawing/2015/9/8/chartex" xmlns:cx2="http://schemas.microsoft.com/office/drawing/2015/10/21/chartex" xmlns:cx3="http://schemas.microsoft.com/office/drawing/2016/5/9/chartex" xmlns:cx4="http://schemas.microsoft.com/office/drawing/2016/5/10/chartex" xmlns:cx5="http://schemas.microsoft.com/office/drawing/2016/5/11/chartex" xmlns:cx6="http://schemas.microsoft.com/office/drawing/2016/5/12/chartex" xmlns:cx7="http://schemas.microsoft.com/office/drawing/2016/5/13/chartex" xmlns:cx8="http://schemas.microsoft.com/office/drawing/2016/5/14/chartex" xmlns:mc="http://schemas.openxmlformats.org/markup-compatibility/2006" xmlns:aink="http://schemas.microsoft.com/office/drawing/2016/ink" xmlns:am3d="http://schemas.microsoft.com/office/drawing/2017/model3d" xmlns:o="urn:schemas-microsoft-com:office:office" xmlns:oel="http://schemas.microsoft.com/office/2019/extlst" xmlns:r="http://schemas.openxmlformats.org/officeDocument/2006/relationships" xmlns:m="http://schemas.openxmlformats.org/officeDocument/2006/math" xmlns:v="urn:schemas-microsoft-com:vml" xmlns:wp14="http://schemas.microsoft.com/office/word/2010/wordprocessingDrawing" xmlns:wp="http://schemas.openxmlformats.org/drawingml/2006/wordprocessingDrawing" xmlns:w10="urn:schemas-microsoft-com:office:word" xmlns:w="http://schemas.openxmlformats.org/wordprocessingml/2006/main" xmlns:w14="http://schemas.microsoft.com/office/word/2010/wordml" xmlns:w15="http://schemas.microsoft.com/office/word/2012/wordml" xmlns:w16cex="http://schemas.microsoft.com/office/word/2018/wordml/cex" xmlns:w16cid="http://schemas.microsoft.com/office/word/2016/wordml/cid" xmlns:w16="http://schemas.microsoft.com/office/word/2018/wordml" xmlns:w16du="http://schemas.microsoft.com/office/word/2023/wordml/word16du" xmlns:w16sdtdh="http://schemas.microsoft.com/office/word/2020/wordml/sdtdatahash" xmlns:w16sdtfl="http://schemas.microsoft.com/office/word/2024/wordml/sdtformatlock" xmlns:w16se="http://schemas.microsoft.com/office/word/2015/wordml/symex" xmlns:wpg="http://schemas.microsoft.com/office/word/2010/wordprocessingGroup" xmlns:wpi="http://schemas.microsoft.com/office/word/2010/wordprocessingInk" xmlns:wne="http://schemas.microsoft.com/office/word/2006/wordml" xmlns:wps="http://schemas.microsoft.com/office/word/2010/wordprocessingShape" mc:Ignorable="w14 w15 w16se w16cid w16 w16cex w16sdtdh w16sdtfl w16du wp14">
   <w:sdt>
     <w:sdtPr>
       <w:id w:val="-2031787798"/>
@@ -10067,7 +10726,7 @@
 </file>
 
 <file path=word/footer3.xml><?xml version="1.0" encoding="utf-8"?>
-<w:ftr xmlns:wpc="http://schemas.microsoft.com/office/word/2010/wordprocessingCanvas" xmlns:cx="http://schemas.microsoft.com/office/drawing/2014/chartex" xmlns:cx1="http://schemas.microsoft.com/office/drawing/2015/9/8/chartex" xmlns:cx2="http://schemas.microsoft.com/office/drawing/2015/10/21/chartex" xmlns:cx3="http://schemas.microsoft.com/office/drawing/2016/5/9/chartex" xmlns:cx4="http://schemas.microsoft.com/office/drawing/2016/5/10/chartex" xmlns:cx5="http://schemas.microsoft.com/office/drawing/2016/5/11/chartex" xmlns:cx6="http://schemas.microsoft.com/office/drawing/2016/5/12/chartex" xmlns:cx7="http://schemas.microsoft.com/office/drawing/2016/5/13/chartex" xmlns:cx8="http://schemas.microsoft.com/office/drawing/2016/5/14/chartex" xmlns:mc="http://schemas.openxmlformats.org/markup-compatibility/2006" xmlns:aink="http://schemas.microsoft.com/office/drawing/2016/ink" xmlns:am3d="http://schemas.microsoft.com/office/drawing/2017/model3d" xmlns:o="urn:schemas-microsoft-com:office:office" xmlns:oel="http://schemas.microsoft.com/office/2019/extlst" xmlns:r="http://schemas.openxmlformats.org/officeDocument/2006/relationships" xmlns:m="http://schemas.openxmlformats.org/officeDocument/2006/math" xmlns:v="urn:schemas-microsoft-com:vml" xmlns:wp14="http://schemas.microsoft.com/office/word/2010/wordprocessingDrawing" xmlns:wp="http://schemas.openxmlformats.org/drawingml/2006/wordprocessingDrawing" xmlns:w10="urn:schemas-microsoft-com:office:word" xmlns:w="http://schemas.openxmlformats.org/wordprocessingml/2006/main" xmlns:w14="http://schemas.microsoft.com/office/word/2010/wordml" xmlns:w15="http://schemas.microsoft.com/office/word/2012/wordml" xmlns:w16cei="http://schemas.microsoft.com/office/word/2026/wordml/cei" xmlns:w16cex="http://schemas.microsoft.com/office/word/2018/wordml/cex" xmlns:w16cid="http://schemas.microsoft.com/office/word/2016/wordml/cid" xmlns:w16="http://schemas.microsoft.com/office/word/2018/wordml" xmlns:w16du="http://schemas.microsoft.com/office/word/2023/wordml/word16du" xmlns:w16sdtdh="http://schemas.microsoft.com/office/word/2020/wordml/sdtdatahash" xmlns:w16sdtfl="http://schemas.microsoft.com/office/word/2024/wordml/sdtformatlock" xmlns:w16se="http://schemas.microsoft.com/office/word/2015/wordml/symex" xmlns:wpg="http://schemas.microsoft.com/office/word/2010/wordprocessingGroup" xmlns:wpi="http://schemas.microsoft.com/office/word/2010/wordprocessingInk" xmlns:wne="http://schemas.microsoft.com/office/word/2006/wordml" xmlns:wps="http://schemas.microsoft.com/office/word/2010/wordprocessingShape" mc:Ignorable="w14 w15 w16se w16cid w16 w16cex w16sdtdh w16sdtfl w16du wp14">
+<w:ftr xmlns:wpc="http://schemas.microsoft.com/office/word/2010/wordprocessingCanvas" xmlns:cx="http://schemas.microsoft.com/office/drawing/2014/chartex" xmlns:cx1="http://schemas.microsoft.com/office/drawing/2015/9/8/chartex" xmlns:cx2="http://schemas.microsoft.com/office/drawing/2015/10/21/chartex" xmlns:cx3="http://schemas.microsoft.com/office/drawing/2016/5/9/chartex" xmlns:cx4="http://schemas.microsoft.com/office/drawing/2016/5/10/chartex" xmlns:cx5="http://schemas.microsoft.com/office/drawing/2016/5/11/chartex" xmlns:cx6="http://schemas.microsoft.com/office/drawing/2016/5/12/chartex" xmlns:cx7="http://schemas.microsoft.com/office/drawing/2016/5/13/chartex" xmlns:cx8="http://schemas.microsoft.com/office/drawing/2016/5/14/chartex" xmlns:mc="http://schemas.openxmlformats.org/markup-compatibility/2006" xmlns:aink="http://schemas.microsoft.com/office/drawing/2016/ink" xmlns:am3d="http://schemas.microsoft.com/office/drawing/2017/model3d" xmlns:o="urn:schemas-microsoft-com:office:office" xmlns:oel="http://schemas.microsoft.com/office/2019/extlst" xmlns:r="http://schemas.openxmlformats.org/officeDocument/2006/relationships" xmlns:m="http://schemas.openxmlformats.org/officeDocument/2006/math" xmlns:v="urn:schemas-microsoft-com:vml" xmlns:wp14="http://schemas.microsoft.com/office/word/2010/wordprocessingDrawing" xmlns:wp="http://schemas.openxmlformats.org/drawingml/2006/wordprocessingDrawing" xmlns:w10="urn:schemas-microsoft-com:office:word" xmlns:w="http://schemas.openxmlformats.org/wordprocessingml/2006/main" xmlns:w14="http://schemas.microsoft.com/office/word/2010/wordml" xmlns:w15="http://schemas.microsoft.com/office/word/2012/wordml" xmlns:w16cex="http://schemas.microsoft.com/office/word/2018/wordml/cex" xmlns:w16cid="http://schemas.microsoft.com/office/word/2016/wordml/cid" xmlns:w16="http://schemas.microsoft.com/office/word/2018/wordml" xmlns:w16du="http://schemas.microsoft.com/office/word/2023/wordml/word16du" xmlns:w16sdtdh="http://schemas.microsoft.com/office/word/2020/wordml/sdtdatahash" xmlns:w16sdtfl="http://schemas.microsoft.com/office/word/2024/wordml/sdtformatlock" xmlns:w16se="http://schemas.microsoft.com/office/word/2015/wordml/symex" xmlns:wpg="http://schemas.microsoft.com/office/word/2010/wordprocessingGroup" xmlns:wpi="http://schemas.microsoft.com/office/word/2010/wordprocessingInk" xmlns:wne="http://schemas.microsoft.com/office/word/2006/wordml" xmlns:wps="http://schemas.microsoft.com/office/word/2010/wordprocessingShape" mc:Ignorable="w14 w15 w16se w16cid w16 w16cex w16sdtdh w16sdtfl w16du wp14">
   <w:sdt>
     <w:sdtPr>
       <w:id w:val="-850491248"/>
@@ -10174,7 +10833,7 @@
 </file>
 
 <file path=word/footer4.xml><?xml version="1.0" encoding="utf-8"?>
-<w:ftr xmlns:wpc="http://schemas.microsoft.com/office/word/2010/wordprocessingCanvas" xmlns:cx="http://schemas.microsoft.com/office/drawing/2014/chartex" xmlns:cx1="http://schemas.microsoft.com/office/drawing/2015/9/8/chartex" xmlns:cx2="http://schemas.microsoft.com/office/drawing/2015/10/21/chartex" xmlns:cx3="http://schemas.microsoft.com/office/drawing/2016/5/9/chartex" xmlns:cx4="http://schemas.microsoft.com/office/drawing/2016/5/10/chartex" xmlns:cx5="http://schemas.microsoft.com/office/drawing/2016/5/11/chartex" xmlns:cx6="http://schemas.microsoft.com/office/drawing/2016/5/12/chartex" xmlns:cx7="http://schemas.microsoft.com/office/drawing/2016/5/13/chartex" xmlns:cx8="http://schemas.microsoft.com/office/drawing/2016/5/14/chartex" xmlns:mc="http://schemas.openxmlformats.org/markup-compatibility/2006" xmlns:aink="http://schemas.microsoft.com/office/drawing/2016/ink" xmlns:am3d="http://schemas.microsoft.com/office/drawing/2017/model3d" xmlns:o="urn:schemas-microsoft-com:office:office" xmlns:oel="http://schemas.microsoft.com/office/2019/extlst" xmlns:r="http://schemas.openxmlformats.org/officeDocument/2006/relationships" xmlns:m="http://schemas.openxmlformats.org/officeDocument/2006/math" xmlns:v="urn:schemas-microsoft-com:vml" xmlns:wp14="http://schemas.microsoft.com/office/word/2010/wordprocessingDrawing" xmlns:wp="http://schemas.openxmlformats.org/drawingml/2006/wordprocessingDrawing" xmlns:w10="urn:schemas-microsoft-com:office:word" xmlns:w="http://schemas.openxmlformats.org/wordprocessingml/2006/main" xmlns:w14="http://schemas.microsoft.com/office/word/2010/wordml" xmlns:w15="http://schemas.microsoft.com/office/word/2012/wordml" xmlns:w16cei="http://schemas.microsoft.com/office/word/2026/wordml/cei" xmlns:w16cex="http://schemas.microsoft.com/office/word/2018/wordml/cex" xmlns:w16cid="http://schemas.microsoft.com/office/word/2016/wordml/cid" xmlns:w16="http://schemas.microsoft.com/office/word/2018/wordml" xmlns:w16du="http://schemas.microsoft.com/office/word/2023/wordml/word16du" xmlns:w16sdtdh="http://schemas.microsoft.com/office/word/2020/wordml/sdtdatahash" xmlns:w16sdtfl="http://schemas.microsoft.com/office/word/2024/wordml/sdtformatlock" xmlns:w16se="http://schemas.microsoft.com/office/word/2015/wordml/symex" xmlns:wpg="http://schemas.microsoft.com/office/word/2010/wordprocessingGroup" xmlns:wpi="http://schemas.microsoft.com/office/word/2010/wordprocessingInk" xmlns:wne="http://schemas.microsoft.com/office/word/2006/wordml" xmlns:wps="http://schemas.microsoft.com/office/word/2010/wordprocessingShape" mc:Ignorable="w14 w15 w16se w16cid w16 w16cex w16sdtdh w16sdtfl w16du wp14">
+<w:ftr xmlns:wpc="http://schemas.microsoft.com/office/word/2010/wordprocessingCanvas" xmlns:cx="http://schemas.microsoft.com/office/drawing/2014/chartex" xmlns:cx1="http://schemas.microsoft.com/office/drawing/2015/9/8/chartex" xmlns:cx2="http://schemas.microsoft.com/office/drawing/2015/10/21/chartex" xmlns:cx3="http://schemas.microsoft.com/office/drawing/2016/5/9/chartex" xmlns:cx4="http://schemas.microsoft.com/office/drawing/2016/5/10/chartex" xmlns:cx5="http://schemas.microsoft.com/office/drawing/2016/5/11/chartex" xmlns:cx6="http://schemas.microsoft.com/office/drawing/2016/5/12/chartex" xmlns:cx7="http://schemas.microsoft.com/office/drawing/2016/5/13/chartex" xmlns:cx8="http://schemas.microsoft.com/office/drawing/2016/5/14/chartex" xmlns:mc="http://schemas.openxmlformats.org/markup-compatibility/2006" xmlns:aink="http://schemas.microsoft.com/office/drawing/2016/ink" xmlns:am3d="http://schemas.microsoft.com/office/drawing/2017/model3d" xmlns:o="urn:schemas-microsoft-com:office:office" xmlns:oel="http://schemas.microsoft.com/office/2019/extlst" xmlns:r="http://schemas.openxmlformats.org/officeDocument/2006/relationships" xmlns:m="http://schemas.openxmlformats.org/officeDocument/2006/math" xmlns:v="urn:schemas-microsoft-com:vml" xmlns:wp14="http://schemas.microsoft.com/office/word/2010/wordprocessingDrawing" xmlns:wp="http://schemas.openxmlformats.org/drawingml/2006/wordprocessingDrawing" xmlns:w10="urn:schemas-microsoft-com:office:word" xmlns:w="http://schemas.openxmlformats.org/wordprocessingml/2006/main" xmlns:w14="http://schemas.microsoft.com/office/word/2010/wordml" xmlns:w15="http://schemas.microsoft.com/office/word/2012/wordml" xmlns:w16cex="http://schemas.microsoft.com/office/word/2018/wordml/cex" xmlns:w16cid="http://schemas.microsoft.com/office/word/2016/wordml/cid" xmlns:w16="http://schemas.microsoft.com/office/word/2018/wordml" xmlns:w16du="http://schemas.microsoft.com/office/word/2023/wordml/word16du" xmlns:w16sdtdh="http://schemas.microsoft.com/office/word/2020/wordml/sdtdatahash" xmlns:w16sdtfl="http://schemas.microsoft.com/office/word/2024/wordml/sdtformatlock" xmlns:w16se="http://schemas.microsoft.com/office/word/2015/wordml/symex" xmlns:wpg="http://schemas.microsoft.com/office/word/2010/wordprocessingGroup" xmlns:wpi="http://schemas.microsoft.com/office/word/2010/wordprocessingInk" xmlns:wne="http://schemas.microsoft.com/office/word/2006/wordml" xmlns:wps="http://schemas.microsoft.com/office/word/2010/wordprocessingShape" mc:Ignorable="w14 w15 w16se w16cid w16 w16cex w16sdtdh w16sdtfl w16du wp14">
   <w:sdt>
     <w:sdtPr>
       <w:id w:val="775912906"/>
@@ -10273,7 +10932,7 @@
 </file>
 
 <file path=word/footnotes.xml><?xml version="1.0" encoding="utf-8"?>
-<w:footnotes xmlns:wpc="http://schemas.microsoft.com/office/word/2010/wordprocessingCanvas" xmlns:cx="http://schemas.microsoft.com/office/drawing/2014/chartex" xmlns:cx1="http://schemas.microsoft.com/office/drawing/2015/9/8/chartex" xmlns:cx2="http://schemas.microsoft.com/office/drawing/2015/10/21/chartex" xmlns:cx3="http://schemas.microsoft.com/office/drawing/2016/5/9/chartex" xmlns:cx4="http://schemas.microsoft.com/office/drawing/2016/5/10/chartex" xmlns:cx5="http://schemas.microsoft.com/office/drawing/2016/5/11/chartex" xmlns:cx6="http://schemas.microsoft.com/office/drawing/2016/5/12/chartex" xmlns:cx7="http://schemas.microsoft.com/office/drawing/2016/5/13/chartex" xmlns:cx8="http://schemas.microsoft.com/office/drawing/2016/5/14/chartex" xmlns:mc="http://schemas.openxmlformats.org/markup-compatibility/2006" xmlns:aink="http://schemas.microsoft.com/office/drawing/2016/ink" xmlns:am3d="http://schemas.microsoft.com/office/drawing/2017/model3d" xmlns:o="urn:schemas-microsoft-com:office:office" xmlns:oel="http://schemas.microsoft.com/office/2019/extlst" xmlns:r="http://schemas.openxmlformats.org/officeDocument/2006/relationships" xmlns:m="http://schemas.openxmlformats.org/officeDocument/2006/math" xmlns:v="urn:schemas-microsoft-com:vml" xmlns:wp14="http://schemas.microsoft.com/office/word/2010/wordprocessingDrawing" xmlns:wp="http://schemas.openxmlformats.org/drawingml/2006/wordprocessingDrawing" xmlns:w10="urn:schemas-microsoft-com:office:word" xmlns:w="http://schemas.openxmlformats.org/wordprocessingml/2006/main" xmlns:w14="http://schemas.microsoft.com/office/word/2010/wordml" xmlns:w15="http://schemas.microsoft.com/office/word/2012/wordml" xmlns:w16cei="http://schemas.microsoft.com/office/word/2026/wordml/cei" xmlns:w16cex="http://schemas.microsoft.com/office/word/2018/wordml/cex" xmlns:w16cid="http://schemas.microsoft.com/office/word/2016/wordml/cid" xmlns:w16="http://schemas.microsoft.com/office/word/2018/wordml" xmlns:w16du="http://schemas.microsoft.com/office/word/2023/wordml/word16du" xmlns:w16sdtdh="http://schemas.microsoft.com/office/word/2020/wordml/sdtdatahash" xmlns:w16sdtfl="http://schemas.microsoft.com/office/word/2024/wordml/sdtformatlock" xmlns:w16se="http://schemas.microsoft.com/office/word/2015/wordml/symex" xmlns:wpg="http://schemas.microsoft.com/office/word/2010/wordprocessingGroup" xmlns:wpi="http://schemas.microsoft.com/office/word/2010/wordprocessingInk" xmlns:wne="http://schemas.microsoft.com/office/word/2006/wordml" xmlns:wps="http://schemas.microsoft.com/office/word/2010/wordprocessingShape" mc:Ignorable="w14 w15 w16se w16cid w16 w16cex w16sdtdh w16sdtfl w16du wp14">
+<w:footnotes xmlns:wpc="http://schemas.microsoft.com/office/word/2010/wordprocessingCanvas" xmlns:cx="http://schemas.microsoft.com/office/drawing/2014/chartex" xmlns:cx1="http://schemas.microsoft.com/office/drawing/2015/9/8/chartex" xmlns:cx2="http://schemas.microsoft.com/office/drawing/2015/10/21/chartex" xmlns:cx3="http://schemas.microsoft.com/office/drawing/2016/5/9/chartex" xmlns:cx4="http://schemas.microsoft.com/office/drawing/2016/5/10/chartex" xmlns:cx5="http://schemas.microsoft.com/office/drawing/2016/5/11/chartex" xmlns:cx6="http://schemas.microsoft.com/office/drawing/2016/5/12/chartex" xmlns:cx7="http://schemas.microsoft.com/office/drawing/2016/5/13/chartex" xmlns:cx8="http://schemas.microsoft.com/office/drawing/2016/5/14/chartex" xmlns:mc="http://schemas.openxmlformats.org/markup-compatibility/2006" xmlns:aink="http://schemas.microsoft.com/office/drawing/2016/ink" xmlns:am3d="http://schemas.microsoft.com/office/drawing/2017/model3d" xmlns:o="urn:schemas-microsoft-com:office:office" xmlns:oel="http://schemas.microsoft.com/office/2019/extlst" xmlns:r="http://schemas.openxmlformats.org/officeDocument/2006/relationships" xmlns:m="http://schemas.openxmlformats.org/officeDocument/2006/math" xmlns:v="urn:schemas-microsoft-com:vml" xmlns:wp14="http://schemas.microsoft.com/office/word/2010/wordprocessingDrawing" xmlns:wp="http://schemas.openxmlformats.org/drawingml/2006/wordprocessingDrawing" xmlns:w10="urn:schemas-microsoft-com:office:word" xmlns:w="http://schemas.openxmlformats.org/wordprocessingml/2006/main" xmlns:w14="http://schemas.microsoft.com/office/word/2010/wordml" xmlns:w15="http://schemas.microsoft.com/office/word/2012/wordml" xmlns:w16cex="http://schemas.microsoft.com/office/word/2018/wordml/cex" xmlns:w16cid="http://schemas.microsoft.com/office/word/2016/wordml/cid" xmlns:w16="http://schemas.microsoft.com/office/word/2018/wordml" xmlns:w16du="http://schemas.microsoft.com/office/word/2023/wordml/word16du" xmlns:w16sdtdh="http://schemas.microsoft.com/office/word/2020/wordml/sdtdatahash" xmlns:w16sdtfl="http://schemas.microsoft.com/office/word/2024/wordml/sdtformatlock" xmlns:w16se="http://schemas.microsoft.com/office/word/2015/wordml/symex" xmlns:wpg="http://schemas.microsoft.com/office/word/2010/wordprocessingGroup" xmlns:wpi="http://schemas.microsoft.com/office/word/2010/wordprocessingInk" xmlns:wne="http://schemas.microsoft.com/office/word/2006/wordml" xmlns:wps="http://schemas.microsoft.com/office/word/2010/wordprocessingShape" mc:Ignorable="w14 w15 w16se w16cid w16 w16cex w16sdtdh w16sdtfl w16du wp14">
   <w:footnote w:type="separator" w:id="-1">
     <w:p>
       <w:pPr>
@@ -10298,7 +10957,7 @@
 </file>
 
 <file path=word/header1.xml><?xml version="1.0" encoding="utf-8"?>
-<w:hdr xmlns:wpc="http://schemas.microsoft.com/office/word/2010/wordprocessingCanvas" xmlns:cx="http://schemas.microsoft.com/office/drawing/2014/chartex" xmlns:cx1="http://schemas.microsoft.com/office/drawing/2015/9/8/chartex" xmlns:cx2="http://schemas.microsoft.com/office/drawing/2015/10/21/chartex" xmlns:cx3="http://schemas.microsoft.com/office/drawing/2016/5/9/chartex" xmlns:cx4="http://schemas.microsoft.com/office/drawing/2016/5/10/chartex" xmlns:cx5="http://schemas.microsoft.com/office/drawing/2016/5/11/chartex" xmlns:cx6="http://schemas.microsoft.com/office/drawing/2016/5/12/chartex" xmlns:cx7="http://schemas.microsoft.com/office/drawing/2016/5/13/chartex" xmlns:cx8="http://schemas.microsoft.com/office/drawing/2016/5/14/chartex" xmlns:mc="http://schemas.openxmlformats.org/markup-compatibility/2006" xmlns:aink="http://schemas.microsoft.com/office/drawing/2016/ink" xmlns:am3d="http://schemas.microsoft.com/office/drawing/2017/model3d" xmlns:o="urn:schemas-microsoft-com:office:office" xmlns:oel="http://schemas.microsoft.com/office/2019/extlst" xmlns:r="http://schemas.openxmlformats.org/officeDocument/2006/relationships" xmlns:m="http://schemas.openxmlformats.org/officeDocument/2006/math" xmlns:v="urn:schemas-microsoft-com:vml" xmlns:wp14="http://schemas.microsoft.com/office/word/2010/wordprocessingDrawing" xmlns:wp="http://schemas.openxmlformats.org/drawingml/2006/wordprocessingDrawing" xmlns:w10="urn:schemas-microsoft-com:office:word" xmlns:w="http://schemas.openxmlformats.org/wordprocessingml/2006/main" xmlns:w14="http://schemas.microsoft.com/office/word/2010/wordml" xmlns:w15="http://schemas.microsoft.com/office/word/2012/wordml" xmlns:w16cei="http://schemas.microsoft.com/office/word/2026/wordml/cei" xmlns:w16cex="http://schemas.microsoft.com/office/word/2018/wordml/cex" xmlns:w16cid="http://schemas.microsoft.com/office/word/2016/wordml/cid" xmlns:w16="http://schemas.microsoft.com/office/word/2018/wordml" xmlns:w16du="http://schemas.microsoft.com/office/word/2023/wordml/word16du" xmlns:w16sdtdh="http://schemas.microsoft.com/office/word/2020/wordml/sdtdatahash" xmlns:w16sdtfl="http://schemas.microsoft.com/office/word/2024/wordml/sdtformatlock" xmlns:w16se="http://schemas.microsoft.com/office/word/2015/wordml/symex" xmlns:wpg="http://schemas.microsoft.com/office/word/2010/wordprocessingGroup" xmlns:wpi="http://schemas.microsoft.com/office/word/2010/wordprocessingInk" xmlns:wne="http://schemas.microsoft.com/office/word/2006/wordml" xmlns:wps="http://schemas.microsoft.com/office/word/2010/wordprocessingShape" mc:Ignorable="w14 w15 w16se w16cid w16 w16cex w16sdtdh w16sdtfl w16du wp14">
+<w:hdr xmlns:wpc="http://schemas.microsoft.com/office/word/2010/wordprocessingCanvas" xmlns:cx="http://schemas.microsoft.com/office/drawing/2014/chartex" xmlns:cx1="http://schemas.microsoft.com/office/drawing/2015/9/8/chartex" xmlns:cx2="http://schemas.microsoft.com/office/drawing/2015/10/21/chartex" xmlns:cx3="http://schemas.microsoft.com/office/drawing/2016/5/9/chartex" xmlns:cx4="http://schemas.microsoft.com/office/drawing/2016/5/10/chartex" xmlns:cx5="http://schemas.microsoft.com/office/drawing/2016/5/11/chartex" xmlns:cx6="http://schemas.microsoft.com/office/drawing/2016/5/12/chartex" xmlns:cx7="http://schemas.microsoft.com/office/drawing/2016/5/13/chartex" xmlns:cx8="http://schemas.microsoft.com/office/drawing/2016/5/14/chartex" xmlns:mc="http://schemas.openxmlformats.org/markup-compatibility/2006" xmlns:aink="http://schemas.microsoft.com/office/drawing/2016/ink" xmlns:am3d="http://schemas.microsoft.com/office/drawing/2017/model3d" xmlns:o="urn:schemas-microsoft-com:office:office" xmlns:oel="http://schemas.microsoft.com/office/2019/extlst" xmlns:r="http://schemas.openxmlformats.org/officeDocument/2006/relationships" xmlns:m="http://schemas.openxmlformats.org/officeDocument/2006/math" xmlns:v="urn:schemas-microsoft-com:vml" xmlns:wp14="http://schemas.microsoft.com/office/word/2010/wordprocessingDrawing" xmlns:wp="http://schemas.openxmlformats.org/drawingml/2006/wordprocessingDrawing" xmlns:w10="urn:schemas-microsoft-com:office:word" xmlns:w="http://schemas.openxmlformats.org/wordprocessingml/2006/main" xmlns:w14="http://schemas.microsoft.com/office/word/2010/wordml" xmlns:w15="http://schemas.microsoft.com/office/word/2012/wordml" xmlns:w16cex="http://schemas.microsoft.com/office/word/2018/wordml/cex" xmlns:w16cid="http://schemas.microsoft.com/office/word/2016/wordml/cid" xmlns:w16="http://schemas.microsoft.com/office/word/2018/wordml" xmlns:w16du="http://schemas.microsoft.com/office/word/2023/wordml/word16du" xmlns:w16sdtdh="http://schemas.microsoft.com/office/word/2020/wordml/sdtdatahash" xmlns:w16sdtfl="http://schemas.microsoft.com/office/word/2024/wordml/sdtformatlock" xmlns:w16se="http://schemas.microsoft.com/office/word/2015/wordml/symex" xmlns:wpg="http://schemas.microsoft.com/office/word/2010/wordprocessingGroup" xmlns:wpi="http://schemas.microsoft.com/office/word/2010/wordprocessingInk" xmlns:wne="http://schemas.microsoft.com/office/word/2006/wordml" xmlns:wps="http://schemas.microsoft.com/office/word/2010/wordprocessingShape" mc:Ignorable="w14 w15 w16se w16cid w16 w16cex w16sdtdh w16sdtfl w16du wp14">
   <w:p>
     <w:pPr>
       <w:pStyle w:val="Topptekst"/>
@@ -10308,7 +10967,7 @@
 </file>
 
 <file path=word/header2.xml><?xml version="1.0" encoding="utf-8"?>
-<w:hdr xmlns:wpc="http://schemas.microsoft.com/office/word/2010/wordprocessingCanvas" xmlns:cx="http://schemas.microsoft.com/office/drawing/2014/chartex" xmlns:cx1="http://schemas.microsoft.com/office/drawing/2015/9/8/chartex" xmlns:cx2="http://schemas.microsoft.com/office/drawing/2015/10/21/chartex" xmlns:cx3="http://schemas.microsoft.com/office/drawing/2016/5/9/chartex" xmlns:cx4="http://schemas.microsoft.com/office/drawing/2016/5/10/chartex" xmlns:cx5="http://schemas.microsoft.com/office/drawing/2016/5/11/chartex" xmlns:cx6="http://schemas.microsoft.com/office/drawing/2016/5/12/chartex" xmlns:cx7="http://schemas.microsoft.com/office/drawing/2016/5/13/chartex" xmlns:cx8="http://schemas.microsoft.com/office/drawing/2016/5/14/chartex" xmlns:mc="http://schemas.openxmlformats.org/markup-compatibility/2006" xmlns:aink="http://schemas.microsoft.com/office/drawing/2016/ink" xmlns:am3d="http://schemas.microsoft.com/office/drawing/2017/model3d" xmlns:o="urn:schemas-microsoft-com:office:office" xmlns:oel="http://schemas.microsoft.com/office/2019/extlst" xmlns:r="http://schemas.openxmlformats.org/officeDocument/2006/relationships" xmlns:m="http://schemas.openxmlformats.org/officeDocument/2006/math" xmlns:v="urn:schemas-microsoft-com:vml" xmlns:wp14="http://schemas.microsoft.com/office/word/2010/wordprocessingDrawing" xmlns:wp="http://schemas.openxmlformats.org/drawingml/2006/wordprocessingDrawing" xmlns:w10="urn:schemas-microsoft-com:office:word" xmlns:w="http://schemas.openxmlformats.org/wordprocessingml/2006/main" xmlns:w14="http://schemas.microsoft.com/office/word/2010/wordml" xmlns:w15="http://schemas.microsoft.com/office/word/2012/wordml" xmlns:w16cei="http://schemas.microsoft.com/office/word/2026/wordml/cei" xmlns:w16cex="http://schemas.microsoft.com/office/word/2018/wordml/cex" xmlns:w16cid="http://schemas.microsoft.com/office/word/2016/wordml/cid" xmlns:w16="http://schemas.microsoft.com/office/word/2018/wordml" xmlns:w16du="http://schemas.microsoft.com/office/word/2023/wordml/word16du" xmlns:w16sdtdh="http://schemas.microsoft.com/office/word/2020/wordml/sdtdatahash" xmlns:w16sdtfl="http://schemas.microsoft.com/office/word/2024/wordml/sdtformatlock" xmlns:w16se="http://schemas.microsoft.com/office/word/2015/wordml/symex" xmlns:wpg="http://schemas.microsoft.com/office/word/2010/wordprocessingGroup" xmlns:wpi="http://schemas.microsoft.com/office/word/2010/wordprocessingInk" xmlns:wne="http://schemas.microsoft.com/office/word/2006/wordml" xmlns:wps="http://schemas.microsoft.com/office/word/2010/wordprocessingShape" mc:Ignorable="w14 w15 w16se w16cid w16 w16cex w16sdtdh w16sdtfl w16du wp14">
+<w:hdr xmlns:wpc="http://schemas.microsoft.com/office/word/2010/wordprocessingCanvas" xmlns:cx="http://schemas.microsoft.com/office/drawing/2014/chartex" xmlns:cx1="http://schemas.microsoft.com/office/drawing/2015/9/8/chartex" xmlns:cx2="http://schemas.microsoft.com/office/drawing/2015/10/21/chartex" xmlns:cx3="http://schemas.microsoft.com/office/drawing/2016/5/9/chartex" xmlns:cx4="http://schemas.microsoft.com/office/drawing/2016/5/10/chartex" xmlns:cx5="http://schemas.microsoft.com/office/drawing/2016/5/11/chartex" xmlns:cx6="http://schemas.microsoft.com/office/drawing/2016/5/12/chartex" xmlns:cx7="http://schemas.microsoft.com/office/drawing/2016/5/13/chartex" xmlns:cx8="http://schemas.microsoft.com/office/drawing/2016/5/14/chartex" xmlns:mc="http://schemas.openxmlformats.org/markup-compatibility/2006" xmlns:aink="http://schemas.microsoft.com/office/drawing/2016/ink" xmlns:am3d="http://schemas.microsoft.com/office/drawing/2017/model3d" xmlns:o="urn:schemas-microsoft-com:office:office" xmlns:oel="http://schemas.microsoft.com/office/2019/extlst" xmlns:r="http://schemas.openxmlformats.org/officeDocument/2006/relationships" xmlns:m="http://schemas.openxmlformats.org/officeDocument/2006/math" xmlns:v="urn:schemas-microsoft-com:vml" xmlns:wp14="http://schemas.microsoft.com/office/word/2010/wordprocessingDrawing" xmlns:wp="http://schemas.openxmlformats.org/drawingml/2006/wordprocessingDrawing" xmlns:w10="urn:schemas-microsoft-com:office:word" xmlns:w="http://schemas.openxmlformats.org/wordprocessingml/2006/main" xmlns:w14="http://schemas.microsoft.com/office/word/2010/wordml" xmlns:w15="http://schemas.microsoft.com/office/word/2012/wordml" xmlns:w16cex="http://schemas.microsoft.com/office/word/2018/wordml/cex" xmlns:w16cid="http://schemas.microsoft.com/office/word/2016/wordml/cid" xmlns:w16="http://schemas.microsoft.com/office/word/2018/wordml" xmlns:w16du="http://schemas.microsoft.com/office/word/2023/wordml/word16du" xmlns:w16sdtdh="http://schemas.microsoft.com/office/word/2020/wordml/sdtdatahash" xmlns:w16sdtfl="http://schemas.microsoft.com/office/word/2024/wordml/sdtformatlock" xmlns:w16se="http://schemas.microsoft.com/office/word/2015/wordml/symex" xmlns:wpg="http://schemas.microsoft.com/office/word/2010/wordprocessingGroup" xmlns:wpi="http://schemas.microsoft.com/office/word/2010/wordprocessingInk" xmlns:wne="http://schemas.microsoft.com/office/word/2006/wordml" xmlns:wps="http://schemas.microsoft.com/office/word/2010/wordprocessingShape" mc:Ignorable="w14 w15 w16se w16cid w16 w16cex w16sdtdh w16sdtfl w16du wp14">
   <w:p>
     <w:pPr>
       <w:pStyle w:val="Topptekst"/>
@@ -10334,7 +10993,7 @@
 </file>
 
 <file path=word/header3.xml><?xml version="1.0" encoding="utf-8"?>
-<w:hdr xmlns:wpc="http://schemas.microsoft.com/office/word/2010/wordprocessingCanvas" xmlns:cx="http://schemas.microsoft.com/office/drawing/2014/chartex" xmlns:cx1="http://schemas.microsoft.com/office/drawing/2015/9/8/chartex" xmlns:cx2="http://schemas.microsoft.com/office/drawing/2015/10/21/chartex" xmlns:cx3="http://schemas.microsoft.com/office/drawing/2016/5/9/chartex" xmlns:cx4="http://schemas.microsoft.com/office/drawing/2016/5/10/chartex" xmlns:cx5="http://schemas.microsoft.com/office/drawing/2016/5/11/chartex" xmlns:cx6="http://schemas.microsoft.com/office/drawing/2016/5/12/chartex" xmlns:cx7="http://schemas.microsoft.com/office/drawing/2016/5/13/chartex" xmlns:cx8="http://schemas.microsoft.com/office/drawing/2016/5/14/chartex" xmlns:mc="http://schemas.openxmlformats.org/markup-compatibility/2006" xmlns:aink="http://schemas.microsoft.com/office/drawing/2016/ink" xmlns:am3d="http://schemas.microsoft.com/office/drawing/2017/model3d" xmlns:o="urn:schemas-microsoft-com:office:office" xmlns:oel="http://schemas.microsoft.com/office/2019/extlst" xmlns:r="http://schemas.openxmlformats.org/officeDocument/2006/relationships" xmlns:m="http://schemas.openxmlformats.org/officeDocument/2006/math" xmlns:v="urn:schemas-microsoft-com:vml" xmlns:wp14="http://schemas.microsoft.com/office/word/2010/wordprocessingDrawing" xmlns:wp="http://schemas.openxmlformats.org/drawingml/2006/wordprocessingDrawing" xmlns:w10="urn:schemas-microsoft-com:office:word" xmlns:w="http://schemas.openxmlformats.org/wordprocessingml/2006/main" xmlns:w14="http://schemas.microsoft.com/office/word/2010/wordml" xmlns:w15="http://schemas.microsoft.com/office/word/2012/wordml" xmlns:w16cei="http://schemas.microsoft.com/office/word/2026/wordml/cei" xmlns:w16cex="http://schemas.microsoft.com/office/word/2018/wordml/cex" xmlns:w16cid="http://schemas.microsoft.com/office/word/2016/wordml/cid" xmlns:w16="http://schemas.microsoft.com/office/word/2018/wordml" xmlns:w16du="http://schemas.microsoft.com/office/word/2023/wordml/word16du" xmlns:w16sdtdh="http://schemas.microsoft.com/office/word/2020/wordml/sdtdatahash" xmlns:w16sdtfl="http://schemas.microsoft.com/office/word/2024/wordml/sdtformatlock" xmlns:w16se="http://schemas.microsoft.com/office/word/2015/wordml/symex" xmlns:wpg="http://schemas.microsoft.com/office/word/2010/wordprocessingGroup" xmlns:wpi="http://schemas.microsoft.com/office/word/2010/wordprocessingInk" xmlns:wne="http://schemas.microsoft.com/office/word/2006/wordml" xmlns:wps="http://schemas.microsoft.com/office/word/2010/wordprocessingShape" mc:Ignorable="w14 w15 w16se w16cid w16 w16cex w16sdtdh w16sdtfl w16du wp14">
+<w:hdr xmlns:wpc="http://schemas.microsoft.com/office/word/2010/wordprocessingCanvas" xmlns:cx="http://schemas.microsoft.com/office/drawing/2014/chartex" xmlns:cx1="http://schemas.microsoft.com/office/drawing/2015/9/8/chartex" xmlns:cx2="http://schemas.microsoft.com/office/drawing/2015/10/21/chartex" xmlns:cx3="http://schemas.microsoft.com/office/drawing/2016/5/9/chartex" xmlns:cx4="http://schemas.microsoft.com/office/drawing/2016/5/10/chartex" xmlns:cx5="http://schemas.microsoft.com/office/drawing/2016/5/11/chartex" xmlns:cx6="http://schemas.microsoft.com/office/drawing/2016/5/12/chartex" xmlns:cx7="http://schemas.microsoft.com/office/drawing/2016/5/13/chartex" xmlns:cx8="http://schemas.microsoft.com/office/drawing/2016/5/14/chartex" xmlns:mc="http://schemas.openxmlformats.org/markup-compatibility/2006" xmlns:aink="http://schemas.microsoft.com/office/drawing/2016/ink" xmlns:am3d="http://schemas.microsoft.com/office/drawing/2017/model3d" xmlns:o="urn:schemas-microsoft-com:office:office" xmlns:oel="http://schemas.microsoft.com/office/2019/extlst" xmlns:r="http://schemas.openxmlformats.org/officeDocument/2006/relationships" xmlns:m="http://schemas.openxmlformats.org/officeDocument/2006/math" xmlns:v="urn:schemas-microsoft-com:vml" xmlns:wp14="http://schemas.microsoft.com/office/word/2010/wordprocessingDrawing" xmlns:wp="http://schemas.openxmlformats.org/drawingml/2006/wordprocessingDrawing" xmlns:w10="urn:schemas-microsoft-com:office:word" xmlns:w="http://schemas.openxmlformats.org/wordprocessingml/2006/main" xmlns:w14="http://schemas.microsoft.com/office/word/2010/wordml" xmlns:w15="http://schemas.microsoft.com/office/word/2012/wordml" xmlns:w16cex="http://schemas.microsoft.com/office/word/2018/wordml/cex" xmlns:w16cid="http://schemas.microsoft.com/office/word/2016/wordml/cid" xmlns:w16="http://schemas.microsoft.com/office/word/2018/wordml" xmlns:w16du="http://schemas.microsoft.com/office/word/2023/wordml/word16du" xmlns:w16sdtdh="http://schemas.microsoft.com/office/word/2020/wordml/sdtdatahash" xmlns:w16sdtfl="http://schemas.microsoft.com/office/word/2024/wordml/sdtformatlock" xmlns:w16se="http://schemas.microsoft.com/office/word/2015/wordml/symex" xmlns:wpg="http://schemas.microsoft.com/office/word/2010/wordprocessingGroup" xmlns:wpi="http://schemas.microsoft.com/office/word/2010/wordprocessingInk" xmlns:wne="http://schemas.microsoft.com/office/word/2006/wordml" xmlns:wps="http://schemas.microsoft.com/office/word/2010/wordprocessingShape" mc:Ignorable="w14 w15 w16se w16cid w16 w16cex w16sdtdh w16sdtfl w16du wp14">
   <w:p>
     <w:r>
       <w:rPr>
@@ -10408,7 +11067,7 @@
 </file>
 
 <file path=word/numbering.xml><?xml version="1.0" encoding="utf-8"?>
-<w:numbering xmlns:wpc="http://schemas.microsoft.com/office/word/2010/wordprocessingCanvas" xmlns:cx="http://schemas.microsoft.com/office/drawing/2014/chartex" xmlns:cx1="http://schemas.microsoft.com/office/drawing/2015/9/8/chartex" xmlns:cx2="http://schemas.microsoft.com/office/drawing/2015/10/21/chartex" xmlns:cx3="http://schemas.microsoft.com/office/drawing/2016/5/9/chartex" xmlns:cx4="http://schemas.microsoft.com/office/drawing/2016/5/10/chartex" xmlns:cx5="http://schemas.microsoft.com/office/drawing/2016/5/11/chartex" xmlns:cx6="http://schemas.microsoft.com/office/drawing/2016/5/12/chartex" xmlns:cx7="http://schemas.microsoft.com/office/drawing/2016/5/13/chartex" xmlns:cx8="http://schemas.microsoft.com/office/drawing/2016/5/14/chartex" xmlns:mc="http://schemas.openxmlformats.org/markup-compatibility/2006" xmlns:aink="http://schemas.microsoft.com/office/drawing/2016/ink" xmlns:am3d="http://schemas.microsoft.com/office/drawing/2017/model3d" xmlns:o="urn:schemas-microsoft-com:office:office" xmlns:oel="http://schemas.microsoft.com/office/2019/extlst" xmlns:r="http://schemas.openxmlformats.org/officeDocument/2006/relationships" xmlns:m="http://schemas.openxmlformats.org/officeDocument/2006/math" xmlns:v="urn:schemas-microsoft-com:vml" xmlns:wp14="http://schemas.microsoft.com/office/word/2010/wordprocessingDrawing" xmlns:wp="http://schemas.openxmlformats.org/drawingml/2006/wordprocessingDrawing" xmlns:w10="urn:schemas-microsoft-com:office:word" xmlns:w="http://schemas.openxmlformats.org/wordprocessingml/2006/main" xmlns:w14="http://schemas.microsoft.com/office/word/2010/wordml" xmlns:w15="http://schemas.microsoft.com/office/word/2012/wordml" xmlns:w16cei="http://schemas.microsoft.com/office/word/2026/wordml/cei" xmlns:w16cex="http://schemas.microsoft.com/office/word/2018/wordml/cex" xmlns:w16cid="http://schemas.microsoft.com/office/word/2016/wordml/cid" xmlns:w16="http://schemas.microsoft.com/office/word/2018/wordml" xmlns:w16du="http://schemas.microsoft.com/office/word/2023/wordml/word16du" xmlns:w16sdtdh="http://schemas.microsoft.com/office/word/2020/wordml/sdtdatahash" xmlns:w16sdtfl="http://schemas.microsoft.com/office/word/2024/wordml/sdtformatlock" xmlns:w16se="http://schemas.microsoft.com/office/word/2015/wordml/symex" xmlns:wpg="http://schemas.microsoft.com/office/word/2010/wordprocessingGroup" xmlns:wpi="http://schemas.microsoft.com/office/word/2010/wordprocessingInk" xmlns:wne="http://schemas.microsoft.com/office/word/2006/wordml" xmlns:wps="http://schemas.microsoft.com/office/word/2010/wordprocessingShape" mc:Ignorable="w14 w15 w16se w16cid w16 w16cex w16sdtdh w16sdtfl w16du wp14">
+<w:numbering xmlns:wpc="http://schemas.microsoft.com/office/word/2010/wordprocessingCanvas" xmlns:cx="http://schemas.microsoft.com/office/drawing/2014/chartex" xmlns:cx1="http://schemas.microsoft.com/office/drawing/2015/9/8/chartex" xmlns:cx2="http://schemas.microsoft.com/office/drawing/2015/10/21/chartex" xmlns:cx3="http://schemas.microsoft.com/office/drawing/2016/5/9/chartex" xmlns:cx4="http://schemas.microsoft.com/office/drawing/2016/5/10/chartex" xmlns:cx5="http://schemas.microsoft.com/office/drawing/2016/5/11/chartex" xmlns:cx6="http://schemas.microsoft.com/office/drawing/2016/5/12/chartex" xmlns:cx7="http://schemas.microsoft.com/office/drawing/2016/5/13/chartex" xmlns:cx8="http://schemas.microsoft.com/office/drawing/2016/5/14/chartex" xmlns:mc="http://schemas.openxmlformats.org/markup-compatibility/2006" xmlns:aink="http://schemas.microsoft.com/office/drawing/2016/ink" xmlns:am3d="http://schemas.microsoft.com/office/drawing/2017/model3d" xmlns:o="urn:schemas-microsoft-com:office:office" xmlns:oel="http://schemas.microsoft.com/office/2019/extlst" xmlns:r="http://schemas.openxmlformats.org/officeDocument/2006/relationships" xmlns:m="http://schemas.openxmlformats.org/officeDocument/2006/math" xmlns:v="urn:schemas-microsoft-com:vml" xmlns:wp14="http://schemas.microsoft.com/office/word/2010/wordprocessingDrawing" xmlns:wp="http://schemas.openxmlformats.org/drawingml/2006/wordprocessingDrawing" xmlns:w10="urn:schemas-microsoft-com:office:word" xmlns:w="http://schemas.openxmlformats.org/wordprocessingml/2006/main" xmlns:w14="http://schemas.microsoft.com/office/word/2010/wordml" xmlns:w15="http://schemas.microsoft.com/office/word/2012/wordml" xmlns:w16cex="http://schemas.microsoft.com/office/word/2018/wordml/cex" xmlns:w16cid="http://schemas.microsoft.com/office/word/2016/wordml/cid" xmlns:w16="http://schemas.microsoft.com/office/word/2018/wordml" xmlns:w16du="http://schemas.microsoft.com/office/word/2023/wordml/word16du" xmlns:w16sdtdh="http://schemas.microsoft.com/office/word/2020/wordml/sdtdatahash" xmlns:w16sdtfl="http://schemas.microsoft.com/office/word/2024/wordml/sdtformatlock" xmlns:w16se="http://schemas.microsoft.com/office/word/2015/wordml/symex" xmlns:wpg="http://schemas.microsoft.com/office/word/2010/wordprocessingGroup" xmlns:wpi="http://schemas.microsoft.com/office/word/2010/wordprocessingInk" xmlns:wne="http://schemas.microsoft.com/office/word/2006/wordml" xmlns:wps="http://schemas.microsoft.com/office/word/2010/wordprocessingShape" mc:Ignorable="w14 w15 w16se w16cid w16 w16cex w16sdtdh w16sdtfl w16du wp14">
   <w:abstractNum w:abstractNumId="0" w15:restartNumberingAfterBreak="0">
     <w:nsid w:val="03272987"/>
     <w:multiLevelType w:val="multilevel"/>

</xml_diff>